<commit_message>
Update committee and curriculum vitae
</commit_message>
<xml_diff>
--- a/files/cv.docx
+++ b/files/cv.docx
@@ -18,7 +18,23 @@
           <w:sz w:val="28"/>
           <w:szCs w:val="28"/>
         </w:rPr>
-        <w:t>Updated – July 2026</w:t>
+        <w:t xml:space="preserve">Updated – </w:t>
+      </w:r>
+      <w:r>
+        <w:rPr>
+          <w:rFonts w:ascii="Times New Roman" w:hAnsi="Times New Roman" w:cs="Times New Roman"/>
+          <w:sz w:val="28"/>
+          <w:szCs w:val="28"/>
+        </w:rPr>
+        <w:t>August</w:t>
+      </w:r>
+      <w:r>
+        <w:rPr>
+          <w:rFonts w:ascii="Times New Roman" w:hAnsi="Times New Roman" w:cs="Times New Roman"/>
+          <w:sz w:val="28"/>
+          <w:szCs w:val="28"/>
+        </w:rPr>
+        <w:t xml:space="preserve"> 2026</w:t>
       </w:r>
     </w:p>
     <w:p>
@@ -62,7 +78,7 @@
             <w:sz w:val="28"/>
             <w:szCs w:val="28"/>
           </w:rPr>
-          <w:t>hng@gc.cuny.edu</w:t>
+          <w:t>hunterboonhian.ng@baruch.cuny.edu</w:t>
         </w:r>
       </w:hyperlink>
     </w:p>
@@ -99,6 +115,16 @@
           <w:szCs w:val="28"/>
         </w:rPr>
       </w:pPr>
+      <w:r>
+        <w:rPr>
+          <w:rFonts w:ascii="Times New Roman" w:hAnsi="Times New Roman" w:cs="Times New Roman"/>
+          <w:b/>
+          <w:bCs/>
+          <w:sz w:val="28"/>
+          <w:szCs w:val="28"/>
+        </w:rPr>
+        <w:t>Citizenship: Singaporean</w:t>
+      </w:r>
     </w:p>
     <w:p>
       <w:pPr>
@@ -122,527 +148,8 @@
           <w:sz w:val="28"/>
           <w:szCs w:val="28"/>
         </w:rPr>
-        <w:t>E</w:t>
-      </w:r>
-      <w:r>
-        <w:rPr>
-          <w:rFonts w:ascii="Times New Roman" w:hAnsi="Times New Roman" w:cs="Times New Roman"/>
-          <w:b/>
-          <w:bCs/>
-          <w:sz w:val="28"/>
-          <w:szCs w:val="28"/>
-        </w:rPr>
-        <w:t>DUCATION</w:t>
-      </w:r>
-    </w:p>
-    <w:p>
-      <w:pPr>
-        <w:spacing w:after="0" w:line="240" w:lineRule="auto"/>
-        <w:rPr>
-          <w:rFonts w:ascii="Times New Roman" w:hAnsi="Times New Roman" w:cs="Times New Roman"/>
-          <w:sz w:val="28"/>
-          <w:szCs w:val="28"/>
-        </w:rPr>
-      </w:pPr>
-      <w:r>
-        <w:rPr>
-          <w:rFonts w:ascii="Times New Roman" w:hAnsi="Times New Roman" w:cs="Times New Roman"/>
-          <w:b/>
-          <w:bCs/>
-          <w:sz w:val="28"/>
-          <w:szCs w:val="28"/>
-        </w:rPr>
-        <w:t>Baruch College – City University of New York</w:t>
-      </w:r>
-      <w:r>
-        <w:rPr>
-          <w:rFonts w:ascii="Times New Roman" w:hAnsi="Times New Roman" w:cs="Times New Roman"/>
-          <w:sz w:val="28"/>
-          <w:szCs w:val="28"/>
-        </w:rPr>
-        <w:tab/>
-      </w:r>
-      <w:r>
-        <w:rPr>
-          <w:rFonts w:ascii="Times New Roman" w:hAnsi="Times New Roman" w:cs="Times New Roman"/>
-          <w:sz w:val="28"/>
-          <w:szCs w:val="28"/>
-        </w:rPr>
-        <w:tab/>
-      </w:r>
-      <w:r>
-        <w:rPr>
-          <w:rFonts w:ascii="Times New Roman" w:hAnsi="Times New Roman" w:cs="Times New Roman"/>
-          <w:sz w:val="28"/>
-          <w:szCs w:val="28"/>
-        </w:rPr>
-        <w:tab/>
-        <w:t>New York City</w:t>
-      </w:r>
-    </w:p>
-    <w:p>
-      <w:pPr>
-        <w:spacing w:after="0" w:line="240" w:lineRule="auto"/>
-        <w:rPr>
-          <w:rFonts w:ascii="Times New Roman" w:hAnsi="Times New Roman" w:cs="Times New Roman"/>
-          <w:sz w:val="28"/>
-          <w:szCs w:val="28"/>
-        </w:rPr>
-      </w:pPr>
-      <w:r>
-        <w:rPr>
-          <w:rFonts w:ascii="Times New Roman" w:hAnsi="Times New Roman" w:cs="Times New Roman"/>
-          <w:i/>
-          <w:iCs/>
-          <w:sz w:val="28"/>
-          <w:szCs w:val="28"/>
-        </w:rPr>
-        <w:t>PhD in Business Administration (Accounting)</w:t>
-      </w:r>
-      <w:r>
-        <w:rPr>
-          <w:rFonts w:ascii="Times New Roman" w:hAnsi="Times New Roman" w:cs="Times New Roman"/>
-          <w:sz w:val="28"/>
-          <w:szCs w:val="28"/>
-        </w:rPr>
-        <w:tab/>
-      </w:r>
-      <w:r>
-        <w:rPr>
-          <w:rFonts w:ascii="Times New Roman" w:hAnsi="Times New Roman" w:cs="Times New Roman"/>
-          <w:sz w:val="28"/>
-          <w:szCs w:val="28"/>
-        </w:rPr>
-        <w:tab/>
-      </w:r>
-      <w:r>
-        <w:rPr>
-          <w:rFonts w:ascii="Times New Roman" w:hAnsi="Times New Roman" w:cs="Times New Roman"/>
-          <w:sz w:val="28"/>
-          <w:szCs w:val="28"/>
-        </w:rPr>
-        <w:tab/>
-      </w:r>
-      <w:r>
-        <w:rPr>
-          <w:rFonts w:ascii="Times New Roman" w:hAnsi="Times New Roman" w:cs="Times New Roman"/>
-          <w:sz w:val="28"/>
-          <w:szCs w:val="28"/>
-        </w:rPr>
-        <w:t>2022-Present</w:t>
-      </w:r>
-    </w:p>
-    <w:p>
-      <w:pPr>
-        <w:spacing w:after="0" w:line="240" w:lineRule="auto"/>
-        <w:rPr>
-          <w:rFonts w:ascii="Times New Roman" w:hAnsi="Times New Roman" w:cs="Times New Roman"/>
-          <w:sz w:val="28"/>
-          <w:szCs w:val="28"/>
-        </w:rPr>
-      </w:pPr>
-      <w:r>
-        <w:rPr>
-          <w:rFonts w:ascii="Times New Roman" w:hAnsi="Times New Roman" w:cs="Times New Roman"/>
-          <w:i/>
-          <w:iCs/>
-          <w:sz w:val="28"/>
-          <w:szCs w:val="28"/>
-        </w:rPr>
-        <w:t xml:space="preserve">Masters </w:t>
-      </w:r>
-      <w:r>
-        <w:rPr>
-          <w:rFonts w:ascii="Times New Roman" w:hAnsi="Times New Roman" w:cs="Times New Roman"/>
-          <w:i/>
-          <w:iCs/>
-          <w:sz w:val="28"/>
-          <w:szCs w:val="28"/>
-        </w:rPr>
-        <w:t>of</w:t>
-      </w:r>
-      <w:r>
-        <w:rPr>
-          <w:rFonts w:ascii="Times New Roman" w:hAnsi="Times New Roman" w:cs="Times New Roman"/>
-          <w:i/>
-          <w:iCs/>
-          <w:sz w:val="28"/>
-          <w:szCs w:val="28"/>
-        </w:rPr>
-        <w:t xml:space="preserve"> Business Administration</w:t>
-      </w:r>
-      <w:r>
-        <w:rPr>
-          <w:rFonts w:ascii="Times New Roman" w:hAnsi="Times New Roman" w:cs="Times New Roman"/>
-          <w:sz w:val="28"/>
-          <w:szCs w:val="28"/>
-        </w:rPr>
-        <w:tab/>
-      </w:r>
-      <w:r>
-        <w:rPr>
-          <w:rFonts w:ascii="Times New Roman" w:hAnsi="Times New Roman" w:cs="Times New Roman"/>
-          <w:sz w:val="28"/>
-          <w:szCs w:val="28"/>
-        </w:rPr>
-        <w:tab/>
-      </w:r>
-      <w:r>
-        <w:rPr>
-          <w:rFonts w:ascii="Times New Roman" w:hAnsi="Times New Roman" w:cs="Times New Roman"/>
-          <w:sz w:val="28"/>
-          <w:szCs w:val="28"/>
-        </w:rPr>
-        <w:tab/>
-      </w:r>
-      <w:r>
-        <w:rPr>
-          <w:rFonts w:ascii="Times New Roman" w:hAnsi="Times New Roman" w:cs="Times New Roman"/>
-          <w:sz w:val="28"/>
-          <w:szCs w:val="28"/>
-        </w:rPr>
-        <w:tab/>
-      </w:r>
-      <w:r>
-        <w:rPr>
-          <w:rFonts w:ascii="Times New Roman" w:hAnsi="Times New Roman" w:cs="Times New Roman"/>
-          <w:sz w:val="28"/>
-          <w:szCs w:val="28"/>
-        </w:rPr>
-        <w:tab/>
-        <w:t>202</w:t>
-      </w:r>
-      <w:r>
-        <w:rPr>
-          <w:rFonts w:ascii="Times New Roman" w:hAnsi="Times New Roman" w:cs="Times New Roman"/>
-          <w:sz w:val="28"/>
-          <w:szCs w:val="28"/>
-        </w:rPr>
-        <w:t>5</w:t>
-      </w:r>
-    </w:p>
-    <w:p>
-      <w:pPr>
-        <w:spacing w:after="0" w:line="240" w:lineRule="auto"/>
-        <w:rPr>
-          <w:rFonts w:ascii="Times New Roman" w:hAnsi="Times New Roman" w:cs="Times New Roman"/>
-          <w:sz w:val="28"/>
-          <w:szCs w:val="28"/>
-        </w:rPr>
-      </w:pPr>
-    </w:p>
-    <w:p>
-      <w:pPr>
-        <w:spacing w:after="0" w:line="240" w:lineRule="auto"/>
-        <w:rPr>
-          <w:rFonts w:ascii="Times New Roman" w:hAnsi="Times New Roman" w:cs="Times New Roman"/>
-          <w:sz w:val="28"/>
-          <w:szCs w:val="28"/>
-        </w:rPr>
-      </w:pPr>
-      <w:r>
-        <w:rPr>
-          <w:rFonts w:ascii="Times New Roman" w:hAnsi="Times New Roman" w:cs="Times New Roman"/>
-          <w:b/>
-          <w:bCs/>
-          <w:sz w:val="28"/>
-          <w:szCs w:val="28"/>
-        </w:rPr>
-        <w:t>Nanyang Technological University</w:t>
-      </w:r>
-      <w:r>
-        <w:rPr>
-          <w:rFonts w:ascii="Times New Roman" w:hAnsi="Times New Roman" w:cs="Times New Roman"/>
-          <w:b/>
-          <w:bCs/>
-          <w:sz w:val="28"/>
-          <w:szCs w:val="28"/>
-        </w:rPr>
-        <w:tab/>
-      </w:r>
-      <w:r>
-        <w:rPr>
-          <w:rFonts w:ascii="Times New Roman" w:hAnsi="Times New Roman" w:cs="Times New Roman"/>
-          <w:sz w:val="28"/>
-          <w:szCs w:val="28"/>
-        </w:rPr>
-        <w:tab/>
-      </w:r>
-      <w:r>
-        <w:rPr>
-          <w:rFonts w:ascii="Times New Roman" w:hAnsi="Times New Roman" w:cs="Times New Roman"/>
-          <w:sz w:val="28"/>
-          <w:szCs w:val="28"/>
-        </w:rPr>
-        <w:tab/>
-      </w:r>
-      <w:r>
-        <w:rPr>
-          <w:rFonts w:ascii="Times New Roman" w:hAnsi="Times New Roman" w:cs="Times New Roman"/>
-          <w:sz w:val="28"/>
-          <w:szCs w:val="28"/>
-        </w:rPr>
-        <w:tab/>
-      </w:r>
-      <w:r>
-        <w:rPr>
-          <w:rFonts w:ascii="Times New Roman" w:hAnsi="Times New Roman" w:cs="Times New Roman"/>
-          <w:sz w:val="28"/>
-          <w:szCs w:val="28"/>
-        </w:rPr>
-        <w:tab/>
-        <w:t>Singapore</w:t>
-      </w:r>
-    </w:p>
-    <w:p>
-      <w:pPr>
-        <w:spacing w:after="0" w:line="240" w:lineRule="auto"/>
-        <w:rPr>
-          <w:rFonts w:ascii="Times New Roman" w:hAnsi="Times New Roman" w:cs="Times New Roman"/>
-          <w:i/>
-          <w:iCs/>
-          <w:sz w:val="28"/>
-          <w:szCs w:val="28"/>
-        </w:rPr>
-      </w:pPr>
-      <w:r>
-        <w:rPr>
-          <w:rFonts w:ascii="Times New Roman" w:hAnsi="Times New Roman" w:cs="Times New Roman"/>
-          <w:i/>
-          <w:iCs/>
-          <w:sz w:val="28"/>
-          <w:szCs w:val="28"/>
-        </w:rPr>
-        <w:t xml:space="preserve">Graduate Certificate in </w:t>
-      </w:r>
-      <w:proofErr w:type="spellStart"/>
-      <w:r>
-        <w:rPr>
-          <w:rFonts w:ascii="Times New Roman" w:hAnsi="Times New Roman" w:cs="Times New Roman"/>
-          <w:i/>
-          <w:iCs/>
-          <w:sz w:val="28"/>
-          <w:szCs w:val="28"/>
-        </w:rPr>
-        <w:t>Technopreneurship</w:t>
-      </w:r>
-      <w:proofErr w:type="spellEnd"/>
-      <w:r>
-        <w:rPr>
-          <w:rFonts w:ascii="Times New Roman" w:hAnsi="Times New Roman" w:cs="Times New Roman"/>
-          <w:i/>
-          <w:iCs/>
-          <w:sz w:val="28"/>
-          <w:szCs w:val="28"/>
-        </w:rPr>
-        <w:t xml:space="preserve"> and Innovation</w:t>
-      </w:r>
-      <w:r>
-        <w:rPr>
-          <w:rFonts w:ascii="Times New Roman" w:hAnsi="Times New Roman" w:cs="Times New Roman"/>
-          <w:i/>
-          <w:iCs/>
-          <w:sz w:val="28"/>
-          <w:szCs w:val="28"/>
-        </w:rPr>
-        <w:tab/>
-      </w:r>
-      <w:r>
-        <w:rPr>
-          <w:rFonts w:ascii="Times New Roman" w:hAnsi="Times New Roman" w:cs="Times New Roman"/>
-          <w:sz w:val="28"/>
-          <w:szCs w:val="28"/>
-        </w:rPr>
-        <w:t>2020</w:t>
-      </w:r>
-    </w:p>
-    <w:p>
-      <w:pPr>
-        <w:spacing w:after="0" w:line="240" w:lineRule="auto"/>
-        <w:rPr>
-          <w:rFonts w:ascii="Times New Roman" w:hAnsi="Times New Roman" w:cs="Times New Roman"/>
-          <w:sz w:val="28"/>
-          <w:szCs w:val="28"/>
-        </w:rPr>
-      </w:pPr>
-      <w:r>
-        <w:rPr>
-          <w:rFonts w:ascii="Times New Roman" w:hAnsi="Times New Roman" w:cs="Times New Roman"/>
-          <w:i/>
-          <w:iCs/>
-          <w:sz w:val="28"/>
-          <w:szCs w:val="28"/>
-        </w:rPr>
-        <w:t>Bachelors in Accountancy</w:t>
-      </w:r>
-      <w:r>
-        <w:rPr>
-          <w:rFonts w:ascii="Times New Roman" w:hAnsi="Times New Roman" w:cs="Times New Roman"/>
-          <w:i/>
-          <w:iCs/>
-          <w:sz w:val="28"/>
-          <w:szCs w:val="28"/>
-        </w:rPr>
-        <w:t xml:space="preserve"> (First Class </w:t>
-      </w:r>
-      <w:proofErr w:type="spellStart"/>
-      <w:r>
-        <w:rPr>
-          <w:rFonts w:ascii="Times New Roman" w:hAnsi="Times New Roman" w:cs="Times New Roman"/>
-          <w:i/>
-          <w:iCs/>
-          <w:sz w:val="28"/>
-          <w:szCs w:val="28"/>
-        </w:rPr>
-        <w:t>Honours</w:t>
-      </w:r>
-      <w:proofErr w:type="spellEnd"/>
-      <w:r>
-        <w:rPr>
-          <w:rFonts w:ascii="Times New Roman" w:hAnsi="Times New Roman" w:cs="Times New Roman"/>
-          <w:i/>
-          <w:iCs/>
-          <w:sz w:val="28"/>
-          <w:szCs w:val="28"/>
-        </w:rPr>
-        <w:t>)</w:t>
-      </w:r>
-      <w:r>
-        <w:rPr>
-          <w:rFonts w:ascii="Times New Roman" w:hAnsi="Times New Roman" w:cs="Times New Roman"/>
-          <w:sz w:val="28"/>
-          <w:szCs w:val="28"/>
-        </w:rPr>
-        <w:tab/>
-      </w:r>
-      <w:r>
-        <w:rPr>
-          <w:rFonts w:ascii="Times New Roman" w:hAnsi="Times New Roman" w:cs="Times New Roman"/>
-          <w:sz w:val="28"/>
-          <w:szCs w:val="28"/>
-        </w:rPr>
-        <w:tab/>
-      </w:r>
-      <w:r>
-        <w:rPr>
-          <w:rFonts w:ascii="Times New Roman" w:hAnsi="Times New Roman" w:cs="Times New Roman"/>
-          <w:sz w:val="28"/>
-          <w:szCs w:val="28"/>
-        </w:rPr>
-        <w:tab/>
-        <w:t>20</w:t>
-      </w:r>
-      <w:r>
-        <w:rPr>
-          <w:rFonts w:ascii="Times New Roman" w:hAnsi="Times New Roman" w:cs="Times New Roman"/>
-          <w:sz w:val="28"/>
-          <w:szCs w:val="28"/>
-        </w:rPr>
-        <w:t>19</w:t>
-      </w:r>
-    </w:p>
-    <w:p>
-      <w:pPr>
-        <w:spacing w:after="0" w:line="240" w:lineRule="auto"/>
-        <w:rPr>
-          <w:rFonts w:ascii="Times New Roman" w:hAnsi="Times New Roman" w:cs="Times New Roman"/>
-          <w:sz w:val="28"/>
-          <w:szCs w:val="28"/>
-        </w:rPr>
-      </w:pPr>
-      <w:r>
-        <w:rPr>
-          <w:rFonts w:ascii="Times New Roman" w:hAnsi="Times New Roman" w:cs="Times New Roman"/>
-          <w:i/>
-          <w:iCs/>
-          <w:sz w:val="28"/>
-          <w:szCs w:val="28"/>
-        </w:rPr>
-        <w:t>Bachelors in Business Analytics</w:t>
-      </w:r>
-      <w:r>
-        <w:rPr>
-          <w:rFonts w:ascii="Times New Roman" w:hAnsi="Times New Roman" w:cs="Times New Roman"/>
-          <w:sz w:val="28"/>
-          <w:szCs w:val="28"/>
-        </w:rPr>
-        <w:tab/>
-      </w:r>
-      <w:r>
-        <w:rPr>
-          <w:rFonts w:ascii="Times New Roman" w:hAnsi="Times New Roman" w:cs="Times New Roman"/>
-          <w:sz w:val="28"/>
-          <w:szCs w:val="28"/>
-        </w:rPr>
-        <w:t xml:space="preserve"> </w:t>
-      </w:r>
-      <w:r>
-        <w:rPr>
-          <w:rFonts w:ascii="Times New Roman" w:hAnsi="Times New Roman" w:cs="Times New Roman"/>
-          <w:i/>
-          <w:iCs/>
-          <w:sz w:val="28"/>
-          <w:szCs w:val="28"/>
-        </w:rPr>
-        <w:t xml:space="preserve">(First Class </w:t>
-      </w:r>
-      <w:proofErr w:type="spellStart"/>
-      <w:r>
-        <w:rPr>
-          <w:rFonts w:ascii="Times New Roman" w:hAnsi="Times New Roman" w:cs="Times New Roman"/>
-          <w:i/>
-          <w:iCs/>
-          <w:sz w:val="28"/>
-          <w:szCs w:val="28"/>
-        </w:rPr>
-        <w:t>Honours</w:t>
-      </w:r>
-      <w:proofErr w:type="spellEnd"/>
-      <w:r>
-        <w:rPr>
-          <w:rFonts w:ascii="Times New Roman" w:hAnsi="Times New Roman" w:cs="Times New Roman"/>
-          <w:i/>
-          <w:iCs/>
-          <w:sz w:val="28"/>
-          <w:szCs w:val="28"/>
-        </w:rPr>
-        <w:t>)</w:t>
-      </w:r>
-      <w:r>
-        <w:rPr>
-          <w:rFonts w:ascii="Times New Roman" w:hAnsi="Times New Roman" w:cs="Times New Roman"/>
-          <w:sz w:val="28"/>
-          <w:szCs w:val="28"/>
-        </w:rPr>
-        <w:tab/>
-      </w:r>
-      <w:r>
-        <w:rPr>
-          <w:rFonts w:ascii="Times New Roman" w:hAnsi="Times New Roman" w:cs="Times New Roman"/>
-          <w:sz w:val="28"/>
-          <w:szCs w:val="28"/>
-        </w:rPr>
-        <w:tab/>
-        <w:t>20</w:t>
-      </w:r>
-      <w:r>
-        <w:rPr>
-          <w:rFonts w:ascii="Times New Roman" w:hAnsi="Times New Roman" w:cs="Times New Roman"/>
-          <w:sz w:val="28"/>
-          <w:szCs w:val="28"/>
-        </w:rPr>
-        <w:t>19</w:t>
-      </w:r>
-    </w:p>
-    <w:p>
-      <w:pPr>
-        <w:spacing w:after="0" w:line="240" w:lineRule="auto"/>
-        <w:rPr>
-          <w:rFonts w:ascii="Times New Roman" w:hAnsi="Times New Roman" w:cs="Times New Roman"/>
-          <w:sz w:val="28"/>
-          <w:szCs w:val="28"/>
-        </w:rPr>
-      </w:pPr>
+        <w:t>Current Status in US: F1 Visa in USA</w:t>
+      </w:r>
     </w:p>
     <w:p>
       <w:pPr>
@@ -666,6 +173,524 @@
           <w:sz w:val="28"/>
           <w:szCs w:val="28"/>
         </w:rPr>
+        <w:t>US Visa Sponsorship: Will require visa sponsorship</w:t>
+      </w:r>
+    </w:p>
+    <w:p>
+      <w:pPr>
+        <w:pBdr>
+          <w:bottom w:val="single" w:sz="6" w:space="1" w:color="auto"/>
+        </w:pBdr>
+        <w:spacing w:after="0" w:line="240" w:lineRule="auto"/>
+        <w:rPr>
+          <w:rFonts w:ascii="Times New Roman" w:hAnsi="Times New Roman" w:cs="Times New Roman"/>
+          <w:b/>
+          <w:bCs/>
+          <w:sz w:val="28"/>
+          <w:szCs w:val="28"/>
+        </w:rPr>
+      </w:pPr>
+    </w:p>
+    <w:p>
+      <w:pPr>
+        <w:pBdr>
+          <w:bottom w:val="single" w:sz="6" w:space="1" w:color="auto"/>
+        </w:pBdr>
+        <w:spacing w:after="0" w:line="240" w:lineRule="auto"/>
+        <w:rPr>
+          <w:rFonts w:ascii="Times New Roman" w:hAnsi="Times New Roman" w:cs="Times New Roman"/>
+          <w:b/>
+          <w:bCs/>
+          <w:sz w:val="28"/>
+          <w:szCs w:val="28"/>
+        </w:rPr>
+      </w:pPr>
+      <w:r>
+        <w:rPr>
+          <w:rFonts w:ascii="Times New Roman" w:hAnsi="Times New Roman" w:cs="Times New Roman"/>
+          <w:b/>
+          <w:bCs/>
+          <w:sz w:val="28"/>
+          <w:szCs w:val="28"/>
+        </w:rPr>
+        <w:t>E</w:t>
+      </w:r>
+      <w:r>
+        <w:rPr>
+          <w:rFonts w:ascii="Times New Roman" w:hAnsi="Times New Roman" w:cs="Times New Roman"/>
+          <w:b/>
+          <w:bCs/>
+          <w:sz w:val="28"/>
+          <w:szCs w:val="28"/>
+        </w:rPr>
+        <w:t>DUCATION</w:t>
+      </w:r>
+    </w:p>
+    <w:p>
+      <w:pPr>
+        <w:spacing w:after="0" w:line="240" w:lineRule="auto"/>
+        <w:rPr>
+          <w:rFonts w:ascii="Times New Roman" w:hAnsi="Times New Roman" w:cs="Times New Roman"/>
+          <w:sz w:val="28"/>
+          <w:szCs w:val="28"/>
+        </w:rPr>
+      </w:pPr>
+      <w:r>
+        <w:rPr>
+          <w:rFonts w:ascii="Times New Roman" w:hAnsi="Times New Roman" w:cs="Times New Roman"/>
+          <w:b/>
+          <w:bCs/>
+          <w:sz w:val="28"/>
+          <w:szCs w:val="28"/>
+        </w:rPr>
+        <w:t>Baruch College – City University of New York</w:t>
+      </w:r>
+      <w:r>
+        <w:rPr>
+          <w:rFonts w:ascii="Times New Roman" w:hAnsi="Times New Roman" w:cs="Times New Roman"/>
+          <w:sz w:val="28"/>
+          <w:szCs w:val="28"/>
+        </w:rPr>
+        <w:tab/>
+      </w:r>
+      <w:r>
+        <w:rPr>
+          <w:rFonts w:ascii="Times New Roman" w:hAnsi="Times New Roman" w:cs="Times New Roman"/>
+          <w:sz w:val="28"/>
+          <w:szCs w:val="28"/>
+        </w:rPr>
+        <w:tab/>
+      </w:r>
+      <w:r>
+        <w:rPr>
+          <w:rFonts w:ascii="Times New Roman" w:hAnsi="Times New Roman" w:cs="Times New Roman"/>
+          <w:sz w:val="28"/>
+          <w:szCs w:val="28"/>
+        </w:rPr>
+        <w:tab/>
+        <w:t>New York City</w:t>
+      </w:r>
+    </w:p>
+    <w:p>
+      <w:pPr>
+        <w:spacing w:after="0" w:line="240" w:lineRule="auto"/>
+        <w:rPr>
+          <w:rFonts w:ascii="Times New Roman" w:hAnsi="Times New Roman" w:cs="Times New Roman"/>
+          <w:sz w:val="28"/>
+          <w:szCs w:val="28"/>
+        </w:rPr>
+      </w:pPr>
+      <w:r>
+        <w:rPr>
+          <w:rFonts w:ascii="Times New Roman" w:hAnsi="Times New Roman" w:cs="Times New Roman"/>
+          <w:i/>
+          <w:iCs/>
+          <w:sz w:val="28"/>
+          <w:szCs w:val="28"/>
+        </w:rPr>
+        <w:t>PhD in Business Administration (Accounting)</w:t>
+      </w:r>
+      <w:r>
+        <w:rPr>
+          <w:rFonts w:ascii="Times New Roman" w:hAnsi="Times New Roman" w:cs="Times New Roman"/>
+          <w:sz w:val="28"/>
+          <w:szCs w:val="28"/>
+        </w:rPr>
+        <w:tab/>
+      </w:r>
+      <w:r>
+        <w:rPr>
+          <w:rFonts w:ascii="Times New Roman" w:hAnsi="Times New Roman" w:cs="Times New Roman"/>
+          <w:sz w:val="28"/>
+          <w:szCs w:val="28"/>
+        </w:rPr>
+        <w:tab/>
+      </w:r>
+      <w:r>
+        <w:rPr>
+          <w:rFonts w:ascii="Times New Roman" w:hAnsi="Times New Roman" w:cs="Times New Roman"/>
+          <w:sz w:val="28"/>
+          <w:szCs w:val="28"/>
+        </w:rPr>
+        <w:tab/>
+      </w:r>
+      <w:r>
+        <w:rPr>
+          <w:rFonts w:ascii="Times New Roman" w:hAnsi="Times New Roman" w:cs="Times New Roman"/>
+          <w:sz w:val="28"/>
+          <w:szCs w:val="28"/>
+        </w:rPr>
+        <w:t>2022-Present</w:t>
+      </w:r>
+    </w:p>
+    <w:p>
+      <w:pPr>
+        <w:spacing w:after="0" w:line="240" w:lineRule="auto"/>
+        <w:rPr>
+          <w:rFonts w:ascii="Times New Roman" w:hAnsi="Times New Roman" w:cs="Times New Roman"/>
+          <w:sz w:val="28"/>
+          <w:szCs w:val="28"/>
+        </w:rPr>
+      </w:pPr>
+      <w:r>
+        <w:rPr>
+          <w:rFonts w:ascii="Times New Roman" w:hAnsi="Times New Roman" w:cs="Times New Roman"/>
+          <w:i/>
+          <w:iCs/>
+          <w:sz w:val="28"/>
+          <w:szCs w:val="28"/>
+        </w:rPr>
+        <w:t xml:space="preserve">Masters </w:t>
+      </w:r>
+      <w:r>
+        <w:rPr>
+          <w:rFonts w:ascii="Times New Roman" w:hAnsi="Times New Roman" w:cs="Times New Roman"/>
+          <w:i/>
+          <w:iCs/>
+          <w:sz w:val="28"/>
+          <w:szCs w:val="28"/>
+        </w:rPr>
+        <w:t>of</w:t>
+      </w:r>
+      <w:r>
+        <w:rPr>
+          <w:rFonts w:ascii="Times New Roman" w:hAnsi="Times New Roman" w:cs="Times New Roman"/>
+          <w:i/>
+          <w:iCs/>
+          <w:sz w:val="28"/>
+          <w:szCs w:val="28"/>
+        </w:rPr>
+        <w:t xml:space="preserve"> Business Administration</w:t>
+      </w:r>
+      <w:r>
+        <w:rPr>
+          <w:rFonts w:ascii="Times New Roman" w:hAnsi="Times New Roman" w:cs="Times New Roman"/>
+          <w:sz w:val="28"/>
+          <w:szCs w:val="28"/>
+        </w:rPr>
+        <w:tab/>
+      </w:r>
+      <w:r>
+        <w:rPr>
+          <w:rFonts w:ascii="Times New Roman" w:hAnsi="Times New Roman" w:cs="Times New Roman"/>
+          <w:sz w:val="28"/>
+          <w:szCs w:val="28"/>
+        </w:rPr>
+        <w:tab/>
+      </w:r>
+      <w:r>
+        <w:rPr>
+          <w:rFonts w:ascii="Times New Roman" w:hAnsi="Times New Roman" w:cs="Times New Roman"/>
+          <w:sz w:val="28"/>
+          <w:szCs w:val="28"/>
+        </w:rPr>
+        <w:tab/>
+      </w:r>
+      <w:r>
+        <w:rPr>
+          <w:rFonts w:ascii="Times New Roman" w:hAnsi="Times New Roman" w:cs="Times New Roman"/>
+          <w:sz w:val="28"/>
+          <w:szCs w:val="28"/>
+        </w:rPr>
+        <w:tab/>
+      </w:r>
+      <w:r>
+        <w:rPr>
+          <w:rFonts w:ascii="Times New Roman" w:hAnsi="Times New Roman" w:cs="Times New Roman"/>
+          <w:sz w:val="28"/>
+          <w:szCs w:val="28"/>
+        </w:rPr>
+        <w:tab/>
+        <w:t>202</w:t>
+      </w:r>
+      <w:r>
+        <w:rPr>
+          <w:rFonts w:ascii="Times New Roman" w:hAnsi="Times New Roman" w:cs="Times New Roman"/>
+          <w:sz w:val="28"/>
+          <w:szCs w:val="28"/>
+        </w:rPr>
+        <w:t>5</w:t>
+      </w:r>
+    </w:p>
+    <w:p>
+      <w:pPr>
+        <w:spacing w:after="0" w:line="240" w:lineRule="auto"/>
+        <w:rPr>
+          <w:rFonts w:ascii="Times New Roman" w:hAnsi="Times New Roman" w:cs="Times New Roman"/>
+          <w:sz w:val="28"/>
+          <w:szCs w:val="28"/>
+        </w:rPr>
+      </w:pPr>
+    </w:p>
+    <w:p>
+      <w:pPr>
+        <w:spacing w:after="0" w:line="240" w:lineRule="auto"/>
+        <w:rPr>
+          <w:rFonts w:ascii="Times New Roman" w:hAnsi="Times New Roman" w:cs="Times New Roman"/>
+          <w:sz w:val="28"/>
+          <w:szCs w:val="28"/>
+        </w:rPr>
+      </w:pPr>
+      <w:r>
+        <w:rPr>
+          <w:rFonts w:ascii="Times New Roman" w:hAnsi="Times New Roman" w:cs="Times New Roman"/>
+          <w:b/>
+          <w:bCs/>
+          <w:sz w:val="28"/>
+          <w:szCs w:val="28"/>
+        </w:rPr>
+        <w:t>Nanyang Technological University</w:t>
+      </w:r>
+      <w:r>
+        <w:rPr>
+          <w:rFonts w:ascii="Times New Roman" w:hAnsi="Times New Roman" w:cs="Times New Roman"/>
+          <w:b/>
+          <w:bCs/>
+          <w:sz w:val="28"/>
+          <w:szCs w:val="28"/>
+        </w:rPr>
+        <w:tab/>
+      </w:r>
+      <w:r>
+        <w:rPr>
+          <w:rFonts w:ascii="Times New Roman" w:hAnsi="Times New Roman" w:cs="Times New Roman"/>
+          <w:sz w:val="28"/>
+          <w:szCs w:val="28"/>
+        </w:rPr>
+        <w:tab/>
+      </w:r>
+      <w:r>
+        <w:rPr>
+          <w:rFonts w:ascii="Times New Roman" w:hAnsi="Times New Roman" w:cs="Times New Roman"/>
+          <w:sz w:val="28"/>
+          <w:szCs w:val="28"/>
+        </w:rPr>
+        <w:tab/>
+      </w:r>
+      <w:r>
+        <w:rPr>
+          <w:rFonts w:ascii="Times New Roman" w:hAnsi="Times New Roman" w:cs="Times New Roman"/>
+          <w:sz w:val="28"/>
+          <w:szCs w:val="28"/>
+        </w:rPr>
+        <w:tab/>
+      </w:r>
+      <w:r>
+        <w:rPr>
+          <w:rFonts w:ascii="Times New Roman" w:hAnsi="Times New Roman" w:cs="Times New Roman"/>
+          <w:sz w:val="28"/>
+          <w:szCs w:val="28"/>
+        </w:rPr>
+        <w:tab/>
+        <w:t>Singapore</w:t>
+      </w:r>
+    </w:p>
+    <w:p>
+      <w:pPr>
+        <w:spacing w:after="0" w:line="240" w:lineRule="auto"/>
+        <w:rPr>
+          <w:rFonts w:ascii="Times New Roman" w:hAnsi="Times New Roman" w:cs="Times New Roman"/>
+          <w:i/>
+          <w:iCs/>
+          <w:sz w:val="28"/>
+          <w:szCs w:val="28"/>
+        </w:rPr>
+      </w:pPr>
+      <w:r>
+        <w:rPr>
+          <w:rFonts w:ascii="Times New Roman" w:hAnsi="Times New Roman" w:cs="Times New Roman"/>
+          <w:i/>
+          <w:iCs/>
+          <w:sz w:val="28"/>
+          <w:szCs w:val="28"/>
+        </w:rPr>
+        <w:t>Graduate Certificate in Technopreneurship and Innovation</w:t>
+      </w:r>
+      <w:r>
+        <w:rPr>
+          <w:rFonts w:ascii="Times New Roman" w:hAnsi="Times New Roman" w:cs="Times New Roman"/>
+          <w:i/>
+          <w:iCs/>
+          <w:sz w:val="28"/>
+          <w:szCs w:val="28"/>
+        </w:rPr>
+        <w:tab/>
+      </w:r>
+      <w:r>
+        <w:rPr>
+          <w:rFonts w:ascii="Times New Roman" w:hAnsi="Times New Roman" w:cs="Times New Roman"/>
+          <w:sz w:val="28"/>
+          <w:szCs w:val="28"/>
+        </w:rPr>
+        <w:t>2020</w:t>
+      </w:r>
+    </w:p>
+    <w:p>
+      <w:pPr>
+        <w:spacing w:after="0" w:line="240" w:lineRule="auto"/>
+        <w:rPr>
+          <w:rFonts w:ascii="Times New Roman" w:hAnsi="Times New Roman" w:cs="Times New Roman"/>
+          <w:sz w:val="28"/>
+          <w:szCs w:val="28"/>
+        </w:rPr>
+      </w:pPr>
+      <w:r>
+        <w:rPr>
+          <w:rFonts w:ascii="Times New Roman" w:hAnsi="Times New Roman" w:cs="Times New Roman"/>
+          <w:i/>
+          <w:iCs/>
+          <w:sz w:val="28"/>
+          <w:szCs w:val="28"/>
+        </w:rPr>
+        <w:t>Bachelors in Accountancy</w:t>
+      </w:r>
+      <w:r>
+        <w:rPr>
+          <w:rFonts w:ascii="Times New Roman" w:hAnsi="Times New Roman" w:cs="Times New Roman"/>
+          <w:i/>
+          <w:iCs/>
+          <w:sz w:val="28"/>
+          <w:szCs w:val="28"/>
+        </w:rPr>
+        <w:t xml:space="preserve"> (First Class Honours)</w:t>
+      </w:r>
+      <w:r>
+        <w:rPr>
+          <w:rFonts w:ascii="Times New Roman" w:hAnsi="Times New Roman" w:cs="Times New Roman"/>
+          <w:sz w:val="28"/>
+          <w:szCs w:val="28"/>
+        </w:rPr>
+        <w:tab/>
+      </w:r>
+      <w:r>
+        <w:rPr>
+          <w:rFonts w:ascii="Times New Roman" w:hAnsi="Times New Roman" w:cs="Times New Roman"/>
+          <w:sz w:val="28"/>
+          <w:szCs w:val="28"/>
+        </w:rPr>
+        <w:tab/>
+      </w:r>
+      <w:r>
+        <w:rPr>
+          <w:rFonts w:ascii="Times New Roman" w:hAnsi="Times New Roman" w:cs="Times New Roman"/>
+          <w:sz w:val="28"/>
+          <w:szCs w:val="28"/>
+        </w:rPr>
+        <w:tab/>
+        <w:t>20</w:t>
+      </w:r>
+      <w:r>
+        <w:rPr>
+          <w:rFonts w:ascii="Times New Roman" w:hAnsi="Times New Roman" w:cs="Times New Roman"/>
+          <w:sz w:val="28"/>
+          <w:szCs w:val="28"/>
+        </w:rPr>
+        <w:t>19</w:t>
+      </w:r>
+    </w:p>
+    <w:p>
+      <w:pPr>
+        <w:spacing w:after="0" w:line="240" w:lineRule="auto"/>
+        <w:rPr>
+          <w:rFonts w:ascii="Times New Roman" w:hAnsi="Times New Roman" w:cs="Times New Roman"/>
+          <w:sz w:val="28"/>
+          <w:szCs w:val="28"/>
+        </w:rPr>
+      </w:pPr>
+      <w:r>
+        <w:rPr>
+          <w:rFonts w:ascii="Times New Roman" w:hAnsi="Times New Roman" w:cs="Times New Roman"/>
+          <w:i/>
+          <w:iCs/>
+          <w:sz w:val="28"/>
+          <w:szCs w:val="28"/>
+        </w:rPr>
+        <w:t>Bachelors in Business Analytics</w:t>
+      </w:r>
+      <w:r>
+        <w:rPr>
+          <w:rFonts w:ascii="Times New Roman" w:hAnsi="Times New Roman" w:cs="Times New Roman"/>
+          <w:sz w:val="28"/>
+          <w:szCs w:val="28"/>
+        </w:rPr>
+        <w:tab/>
+      </w:r>
+      <w:r>
+        <w:rPr>
+          <w:rFonts w:ascii="Times New Roman" w:hAnsi="Times New Roman" w:cs="Times New Roman"/>
+          <w:sz w:val="28"/>
+          <w:szCs w:val="28"/>
+        </w:rPr>
+        <w:t xml:space="preserve"> </w:t>
+      </w:r>
+      <w:r>
+        <w:rPr>
+          <w:rFonts w:ascii="Times New Roman" w:hAnsi="Times New Roman" w:cs="Times New Roman"/>
+          <w:i/>
+          <w:iCs/>
+          <w:sz w:val="28"/>
+          <w:szCs w:val="28"/>
+        </w:rPr>
+        <w:t>(First Class Honours)</w:t>
+      </w:r>
+      <w:r>
+        <w:rPr>
+          <w:rFonts w:ascii="Times New Roman" w:hAnsi="Times New Roman" w:cs="Times New Roman"/>
+          <w:sz w:val="28"/>
+          <w:szCs w:val="28"/>
+        </w:rPr>
+        <w:tab/>
+      </w:r>
+      <w:r>
+        <w:rPr>
+          <w:rFonts w:ascii="Times New Roman" w:hAnsi="Times New Roman" w:cs="Times New Roman"/>
+          <w:sz w:val="28"/>
+          <w:szCs w:val="28"/>
+        </w:rPr>
+        <w:tab/>
+        <w:t>20</w:t>
+      </w:r>
+      <w:r>
+        <w:rPr>
+          <w:rFonts w:ascii="Times New Roman" w:hAnsi="Times New Roman" w:cs="Times New Roman"/>
+          <w:sz w:val="28"/>
+          <w:szCs w:val="28"/>
+        </w:rPr>
+        <w:t>19</w:t>
+      </w:r>
+    </w:p>
+    <w:p>
+      <w:pPr>
+        <w:spacing w:after="0" w:line="240" w:lineRule="auto"/>
+        <w:rPr>
+          <w:rFonts w:ascii="Times New Roman" w:hAnsi="Times New Roman" w:cs="Times New Roman"/>
+          <w:sz w:val="28"/>
+          <w:szCs w:val="28"/>
+        </w:rPr>
+      </w:pPr>
+    </w:p>
+    <w:p>
+      <w:pPr>
+        <w:pBdr>
+          <w:bottom w:val="single" w:sz="6" w:space="1" w:color="auto"/>
+        </w:pBdr>
+        <w:spacing w:after="0" w:line="240" w:lineRule="auto"/>
+        <w:rPr>
+          <w:rFonts w:ascii="Times New Roman" w:hAnsi="Times New Roman" w:cs="Times New Roman"/>
+          <w:b/>
+          <w:bCs/>
+          <w:sz w:val="28"/>
+          <w:szCs w:val="28"/>
+        </w:rPr>
+      </w:pPr>
+      <w:r>
+        <w:rPr>
+          <w:rFonts w:ascii="Times New Roman" w:hAnsi="Times New Roman" w:cs="Times New Roman"/>
+          <w:b/>
+          <w:bCs/>
+          <w:sz w:val="28"/>
+          <w:szCs w:val="28"/>
+        </w:rPr>
         <w:t>RESEARCH</w:t>
       </w:r>
     </w:p>
@@ -752,258 +777,145 @@
           <w:sz w:val="28"/>
           <w:szCs w:val="28"/>
         </w:rPr>
+        <w:t xml:space="preserve"> Hagit Levy-Shalev</w:t>
+      </w:r>
+      <w:r>
+        <w:rPr>
+          <w:rFonts w:ascii="Times New Roman" w:hAnsi="Times New Roman" w:cs="Times New Roman"/>
+          <w:sz w:val="28"/>
+          <w:szCs w:val="28"/>
+        </w:rPr>
+        <w:t>, Michael Grossman</w:t>
+      </w:r>
+    </w:p>
+    <w:p>
+      <w:pPr>
+        <w:spacing w:after="0" w:line="240" w:lineRule="auto"/>
+        <w:rPr>
+          <w:rFonts w:ascii="Times New Roman" w:hAnsi="Times New Roman" w:cs="Times New Roman"/>
+          <w:b/>
+          <w:bCs/>
+          <w:sz w:val="28"/>
+          <w:szCs w:val="28"/>
+        </w:rPr>
+      </w:pPr>
+    </w:p>
+    <w:p>
+      <w:pPr>
+        <w:spacing w:after="0" w:line="240" w:lineRule="auto"/>
+        <w:rPr>
+          <w:rFonts w:ascii="Times New Roman" w:hAnsi="Times New Roman" w:cs="Times New Roman"/>
+          <w:sz w:val="28"/>
+          <w:szCs w:val="28"/>
+        </w:rPr>
+      </w:pPr>
+      <w:r>
+        <w:rPr>
+          <w:rFonts w:ascii="Times New Roman" w:hAnsi="Times New Roman" w:cs="Times New Roman"/>
+          <w:b/>
+          <w:bCs/>
+          <w:sz w:val="28"/>
+          <w:szCs w:val="28"/>
+        </w:rPr>
+        <w:t>Can AI Replicate Accounting Standard-Setting Experiments? Evidence from Synthetic Participants</w:t>
+      </w:r>
+      <w:r>
+        <w:rPr>
+          <w:rFonts w:ascii="Times New Roman" w:hAnsi="Times New Roman" w:cs="Times New Roman"/>
+          <w:b/>
+          <w:bCs/>
+          <w:sz w:val="28"/>
+          <w:szCs w:val="28"/>
+        </w:rPr>
+        <w:t xml:space="preserve"> – </w:t>
+      </w:r>
+      <w:r>
+        <w:rPr>
+          <w:rFonts w:ascii="Times New Roman" w:hAnsi="Times New Roman" w:cs="Times New Roman"/>
+          <w:sz w:val="28"/>
+          <w:szCs w:val="28"/>
+        </w:rPr>
+        <w:t>Dissertation</w:t>
+      </w:r>
+    </w:p>
+    <w:p>
+      <w:pPr>
+        <w:spacing w:after="0" w:line="240" w:lineRule="auto"/>
+        <w:rPr>
+          <w:rFonts w:ascii="Times New Roman" w:hAnsi="Times New Roman" w:cs="Times New Roman"/>
+          <w:b/>
+          <w:bCs/>
+          <w:sz w:val="28"/>
+          <w:szCs w:val="28"/>
+        </w:rPr>
+      </w:pPr>
+    </w:p>
+    <w:p>
+      <w:pPr>
+        <w:spacing w:after="0" w:line="240" w:lineRule="auto"/>
+        <w:rPr>
+          <w:rFonts w:ascii="Times New Roman" w:hAnsi="Times New Roman" w:cs="Times New Roman"/>
+          <w:sz w:val="28"/>
+          <w:szCs w:val="28"/>
+        </w:rPr>
+      </w:pPr>
+      <w:r>
+        <w:rPr>
+          <w:rFonts w:ascii="Times New Roman" w:hAnsi="Times New Roman" w:cs="Times New Roman"/>
+          <w:b/>
+          <w:bCs/>
+          <w:sz w:val="28"/>
+          <w:szCs w:val="28"/>
+        </w:rPr>
+        <w:t xml:space="preserve">Election Prediction Markets: Evidence from Polymarket, Kalshi </w:t>
+      </w:r>
+      <w:r>
+        <w:rPr>
+          <w:rFonts w:ascii="Times New Roman" w:hAnsi="Times New Roman" w:cs="Times New Roman"/>
+          <w:sz w:val="28"/>
+          <w:szCs w:val="28"/>
+        </w:rPr>
+        <w:t>with Lin Peng</w:t>
+      </w:r>
+      <w:r>
+        <w:rPr>
+          <w:rFonts w:ascii="Times New Roman" w:hAnsi="Times New Roman" w:cs="Times New Roman"/>
+          <w:sz w:val="28"/>
+          <w:szCs w:val="28"/>
+        </w:rPr>
+        <w:t xml:space="preserve"> (Baruch), </w:t>
+      </w:r>
+      <w:r>
+        <w:rPr>
+          <w:rFonts w:ascii="Times New Roman" w:hAnsi="Times New Roman" w:cs="Times New Roman"/>
+          <w:sz w:val="28"/>
+          <w:szCs w:val="28"/>
+        </w:rPr>
+        <w:t>Dexin Zhou</w:t>
+      </w:r>
+      <w:r>
+        <w:rPr>
+          <w:rFonts w:ascii="Times New Roman" w:hAnsi="Times New Roman" w:cs="Times New Roman"/>
+          <w:sz w:val="28"/>
+          <w:szCs w:val="28"/>
+        </w:rPr>
+        <w:t xml:space="preserve"> (Baruch),</w:t>
+      </w:r>
+      <w:r>
+        <w:rPr>
+          <w:rFonts w:ascii="Times New Roman" w:hAnsi="Times New Roman" w:cs="Times New Roman"/>
+          <w:sz w:val="28"/>
+          <w:szCs w:val="28"/>
+        </w:rPr>
         <w:t xml:space="preserve"> </w:t>
       </w:r>
-      <w:proofErr w:type="spellStart"/>
-      <w:r>
-        <w:rPr>
-          <w:rFonts w:ascii="Times New Roman" w:hAnsi="Times New Roman" w:cs="Times New Roman"/>
-          <w:sz w:val="28"/>
-          <w:szCs w:val="28"/>
-        </w:rPr>
-        <w:t>Hagit</w:t>
-      </w:r>
-      <w:proofErr w:type="spellEnd"/>
-      <w:r>
-        <w:rPr>
-          <w:rFonts w:ascii="Times New Roman" w:hAnsi="Times New Roman" w:cs="Times New Roman"/>
-          <w:sz w:val="28"/>
-          <w:szCs w:val="28"/>
-        </w:rPr>
-        <w:t xml:space="preserve"> Levy-Shalev</w:t>
-      </w:r>
-      <w:r>
-        <w:rPr>
-          <w:rFonts w:ascii="Times New Roman" w:hAnsi="Times New Roman" w:cs="Times New Roman"/>
-          <w:sz w:val="28"/>
-          <w:szCs w:val="28"/>
-        </w:rPr>
-        <w:t xml:space="preserve">, </w:t>
-      </w:r>
-      <w:r>
-        <w:rPr>
-          <w:rFonts w:ascii="Times New Roman" w:hAnsi="Times New Roman" w:cs="Times New Roman"/>
-          <w:sz w:val="28"/>
-          <w:szCs w:val="28"/>
-        </w:rPr>
-        <w:t>Diana Weng</w:t>
-      </w:r>
-    </w:p>
-    <w:p>
-      <w:pPr>
-        <w:spacing w:after="0" w:line="240" w:lineRule="auto"/>
-        <w:rPr>
-          <w:rFonts w:ascii="Times New Roman" w:hAnsi="Times New Roman" w:cs="Times New Roman"/>
-          <w:b/>
-          <w:bCs/>
-          <w:sz w:val="28"/>
-          <w:szCs w:val="28"/>
-        </w:rPr>
-      </w:pPr>
-    </w:p>
-    <w:p>
-      <w:pPr>
-        <w:spacing w:after="0" w:line="240" w:lineRule="auto"/>
-        <w:rPr>
-          <w:rFonts w:ascii="Times New Roman" w:hAnsi="Times New Roman" w:cs="Times New Roman"/>
-          <w:sz w:val="28"/>
-          <w:szCs w:val="28"/>
-        </w:rPr>
-      </w:pPr>
-      <w:r>
-        <w:rPr>
-          <w:rFonts w:ascii="Times New Roman" w:hAnsi="Times New Roman" w:cs="Times New Roman"/>
-          <w:b/>
-          <w:bCs/>
-          <w:sz w:val="28"/>
-          <w:szCs w:val="28"/>
-        </w:rPr>
-        <w:t>Can AI Replicate Accounting Standard-Setting Experiments? Evidence from Synthetic Participants</w:t>
-      </w:r>
-      <w:r>
-        <w:rPr>
-          <w:rFonts w:ascii="Times New Roman" w:hAnsi="Times New Roman" w:cs="Times New Roman"/>
-          <w:b/>
-          <w:bCs/>
-          <w:sz w:val="28"/>
-          <w:szCs w:val="28"/>
-        </w:rPr>
-        <w:t xml:space="preserve"> – </w:t>
-      </w:r>
-      <w:r>
-        <w:rPr>
-          <w:rFonts w:ascii="Times New Roman" w:hAnsi="Times New Roman" w:cs="Times New Roman"/>
-          <w:sz w:val="28"/>
-          <w:szCs w:val="28"/>
-        </w:rPr>
-        <w:t>Dissertation</w:t>
-      </w:r>
-    </w:p>
-    <w:p>
-      <w:pPr>
-        <w:pStyle w:val="ListParagraph"/>
-        <w:numPr>
-          <w:ilvl w:val="0"/>
-          <w:numId w:val="2"/>
-        </w:numPr>
-        <w:spacing w:after="0" w:line="240" w:lineRule="auto"/>
-        <w:rPr>
-          <w:rFonts w:ascii="Times New Roman" w:hAnsi="Times New Roman" w:cs="Times New Roman"/>
-          <w:sz w:val="28"/>
-          <w:szCs w:val="28"/>
-        </w:rPr>
-      </w:pPr>
-      <w:r>
-        <w:rPr>
-          <w:rFonts w:ascii="Times New Roman" w:hAnsi="Times New Roman" w:cs="Times New Roman"/>
-          <w:sz w:val="28"/>
-          <w:szCs w:val="28"/>
-        </w:rPr>
-        <w:t>To present at ABO Research Conference 2026</w:t>
-      </w:r>
-    </w:p>
-    <w:p>
-      <w:pPr>
-        <w:spacing w:after="0" w:line="240" w:lineRule="auto"/>
-        <w:rPr>
-          <w:rFonts w:ascii="Times New Roman" w:hAnsi="Times New Roman" w:cs="Times New Roman"/>
-          <w:b/>
-          <w:bCs/>
-          <w:sz w:val="28"/>
-          <w:szCs w:val="28"/>
-        </w:rPr>
-      </w:pPr>
-    </w:p>
-    <w:p>
-      <w:pPr>
-        <w:spacing w:after="0" w:line="240" w:lineRule="auto"/>
-        <w:rPr>
-          <w:rFonts w:ascii="Times New Roman" w:hAnsi="Times New Roman" w:cs="Times New Roman"/>
-          <w:sz w:val="28"/>
-          <w:szCs w:val="28"/>
-        </w:rPr>
-      </w:pPr>
-      <w:r>
-        <w:rPr>
-          <w:rFonts w:ascii="Times New Roman" w:hAnsi="Times New Roman" w:cs="Times New Roman"/>
-          <w:b/>
-          <w:bCs/>
-          <w:sz w:val="28"/>
-          <w:szCs w:val="28"/>
-        </w:rPr>
-        <w:t xml:space="preserve">Election Prediction Markets: Evidence from </w:t>
-      </w:r>
-      <w:proofErr w:type="spellStart"/>
-      <w:r>
-        <w:rPr>
-          <w:rFonts w:ascii="Times New Roman" w:hAnsi="Times New Roman" w:cs="Times New Roman"/>
-          <w:b/>
-          <w:bCs/>
-          <w:sz w:val="28"/>
-          <w:szCs w:val="28"/>
-        </w:rPr>
-        <w:t>Polymarket</w:t>
-      </w:r>
-      <w:proofErr w:type="spellEnd"/>
-      <w:r>
-        <w:rPr>
-          <w:rFonts w:ascii="Times New Roman" w:hAnsi="Times New Roman" w:cs="Times New Roman"/>
-          <w:b/>
-          <w:bCs/>
-          <w:sz w:val="28"/>
-          <w:szCs w:val="28"/>
-        </w:rPr>
-        <w:t xml:space="preserve">, </w:t>
-      </w:r>
-      <w:proofErr w:type="spellStart"/>
-      <w:r>
-        <w:rPr>
-          <w:rFonts w:ascii="Times New Roman" w:hAnsi="Times New Roman" w:cs="Times New Roman"/>
-          <w:b/>
-          <w:bCs/>
-          <w:sz w:val="28"/>
-          <w:szCs w:val="28"/>
-        </w:rPr>
-        <w:t>Kalshi</w:t>
-      </w:r>
-      <w:proofErr w:type="spellEnd"/>
-      <w:r>
-        <w:rPr>
-          <w:rFonts w:ascii="Times New Roman" w:hAnsi="Times New Roman" w:cs="Times New Roman"/>
-          <w:b/>
-          <w:bCs/>
-          <w:sz w:val="28"/>
-          <w:szCs w:val="28"/>
-        </w:rPr>
-        <w:t xml:space="preserve"> </w:t>
-      </w:r>
-      <w:r>
-        <w:rPr>
-          <w:rFonts w:ascii="Times New Roman" w:hAnsi="Times New Roman" w:cs="Times New Roman"/>
-          <w:sz w:val="28"/>
-          <w:szCs w:val="28"/>
-        </w:rPr>
-        <w:t>with Lin Peng</w:t>
-      </w:r>
-      <w:r>
-        <w:rPr>
-          <w:rFonts w:ascii="Times New Roman" w:hAnsi="Times New Roman" w:cs="Times New Roman"/>
-          <w:sz w:val="28"/>
-          <w:szCs w:val="28"/>
-        </w:rPr>
-        <w:t xml:space="preserve"> (Baruch), </w:t>
-      </w:r>
-      <w:proofErr w:type="spellStart"/>
-      <w:r>
-        <w:rPr>
-          <w:rFonts w:ascii="Times New Roman" w:hAnsi="Times New Roman" w:cs="Times New Roman"/>
-          <w:sz w:val="28"/>
-          <w:szCs w:val="28"/>
-        </w:rPr>
-        <w:t>Dexin</w:t>
-      </w:r>
-      <w:proofErr w:type="spellEnd"/>
-      <w:r>
-        <w:rPr>
-          <w:rFonts w:ascii="Times New Roman" w:hAnsi="Times New Roman" w:cs="Times New Roman"/>
-          <w:sz w:val="28"/>
-          <w:szCs w:val="28"/>
-        </w:rPr>
-        <w:t xml:space="preserve"> Zhou</w:t>
-      </w:r>
-      <w:r>
-        <w:rPr>
-          <w:rFonts w:ascii="Times New Roman" w:hAnsi="Times New Roman" w:cs="Times New Roman"/>
-          <w:sz w:val="28"/>
-          <w:szCs w:val="28"/>
-        </w:rPr>
-        <w:t xml:space="preserve"> (Baruch),</w:t>
-      </w:r>
-      <w:r>
-        <w:rPr>
-          <w:rFonts w:ascii="Times New Roman" w:hAnsi="Times New Roman" w:cs="Times New Roman"/>
-          <w:sz w:val="28"/>
-          <w:szCs w:val="28"/>
-        </w:rPr>
-        <w:t xml:space="preserve"> </w:t>
-      </w:r>
-      <w:proofErr w:type="spellStart"/>
-      <w:r>
-        <w:rPr>
-          <w:rFonts w:ascii="Times New Roman" w:hAnsi="Times New Roman" w:cs="Times New Roman"/>
-          <w:sz w:val="28"/>
-          <w:szCs w:val="28"/>
-        </w:rPr>
-        <w:t>Yubo</w:t>
-      </w:r>
-      <w:proofErr w:type="spellEnd"/>
-      <w:r>
-        <w:rPr>
-          <w:rFonts w:ascii="Times New Roman" w:hAnsi="Times New Roman" w:cs="Times New Roman"/>
-          <w:sz w:val="28"/>
-          <w:szCs w:val="28"/>
-        </w:rPr>
-        <w:t xml:space="preserve"> Tao</w:t>
+      <w:r>
+        <w:rPr>
+          <w:rFonts w:ascii="Times New Roman" w:hAnsi="Times New Roman" w:cs="Times New Roman"/>
+          <w:sz w:val="28"/>
+          <w:szCs w:val="28"/>
+        </w:rPr>
+        <w:t>Yubo Tao</w:t>
       </w:r>
       <w:r>
         <w:rPr>
@@ -1065,89 +977,7 @@
           <w:sz w:val="28"/>
           <w:szCs w:val="28"/>
         </w:rPr>
-        <w:t xml:space="preserve">Presented at </w:t>
-      </w:r>
-      <w:r>
-        <w:rPr>
-          <w:rFonts w:ascii="Times New Roman" w:hAnsi="Times New Roman" w:cs="Times New Roman"/>
-          <w:sz w:val="28"/>
-          <w:szCs w:val="28"/>
-        </w:rPr>
-        <w:t>Baruch College, CUFE, PKU-NSD, Fudan University, Hong Kong Polytechnic University, University of Macau, and University of South Carolina</w:t>
-      </w:r>
-    </w:p>
-    <w:p>
-      <w:pPr>
-        <w:spacing w:after="0" w:line="240" w:lineRule="auto"/>
-        <w:rPr>
-          <w:rFonts w:ascii="Times New Roman" w:hAnsi="Times New Roman" w:cs="Times New Roman"/>
-          <w:b/>
-          <w:bCs/>
-          <w:sz w:val="28"/>
-          <w:szCs w:val="28"/>
-        </w:rPr>
-      </w:pPr>
-    </w:p>
-    <w:p>
-      <w:pPr>
-        <w:spacing w:after="0" w:line="240" w:lineRule="auto"/>
-        <w:rPr>
-          <w:rFonts w:ascii="Times New Roman" w:hAnsi="Times New Roman" w:cs="Times New Roman"/>
-          <w:sz w:val="28"/>
-          <w:szCs w:val="28"/>
-        </w:rPr>
-      </w:pPr>
-      <w:r>
-        <w:rPr>
-          <w:rFonts w:ascii="Times New Roman" w:hAnsi="Times New Roman" w:cs="Times New Roman"/>
-          <w:b/>
-          <w:bCs/>
-          <w:sz w:val="28"/>
-          <w:szCs w:val="28"/>
-        </w:rPr>
-        <w:t>Using a Sandboxed Ticketing Bot to Teach Digital Trust and IT Audit</w:t>
-      </w:r>
-      <w:r>
-        <w:rPr>
-          <w:rFonts w:ascii="Times New Roman" w:hAnsi="Times New Roman" w:cs="Times New Roman"/>
-          <w:sz w:val="28"/>
-          <w:szCs w:val="28"/>
-        </w:rPr>
-        <w:t xml:space="preserve"> with Lorraine Lee</w:t>
-      </w:r>
-      <w:r>
-        <w:rPr>
-          <w:rFonts w:ascii="Times New Roman" w:hAnsi="Times New Roman" w:cs="Times New Roman"/>
-          <w:sz w:val="28"/>
-          <w:szCs w:val="28"/>
-        </w:rPr>
-        <w:t xml:space="preserve"> (UNC Wilmington)</w:t>
-      </w:r>
-      <w:r>
-        <w:rPr>
-          <w:rFonts w:ascii="Times New Roman" w:hAnsi="Times New Roman" w:cs="Times New Roman"/>
-          <w:sz w:val="28"/>
-          <w:szCs w:val="28"/>
-        </w:rPr>
-        <w:t xml:space="preserve">, </w:t>
-      </w:r>
-      <w:proofErr w:type="spellStart"/>
-      <w:r>
-        <w:rPr>
-          <w:rFonts w:ascii="Times New Roman" w:hAnsi="Times New Roman" w:cs="Times New Roman"/>
-          <w:sz w:val="28"/>
-          <w:szCs w:val="28"/>
-        </w:rPr>
-        <w:t>Hagit</w:t>
-      </w:r>
-      <w:proofErr w:type="spellEnd"/>
-      <w:r>
-        <w:rPr>
-          <w:rFonts w:ascii="Times New Roman" w:hAnsi="Times New Roman" w:cs="Times New Roman"/>
-          <w:sz w:val="28"/>
-          <w:szCs w:val="28"/>
-        </w:rPr>
-        <w:t xml:space="preserve"> Levy-Shalev (Baruch), Shantel Deleon (EY)</w:t>
+        <w:t>To present at University of Lancaster September 2026</w:t>
       </w:r>
     </w:p>
     <w:p>
@@ -1170,15 +1000,71 @@
           <w:sz w:val="28"/>
           <w:szCs w:val="28"/>
         </w:rPr>
-        <w:t>IRB Approved</w:t>
-      </w:r>
-      <w:r>
-        <w:rPr>
-          <w:rFonts w:ascii="Times New Roman" w:hAnsi="Times New Roman" w:cs="Times New Roman"/>
-          <w:sz w:val="28"/>
-          <w:szCs w:val="28"/>
-        </w:rPr>
-        <w:t xml:space="preserve"> – To be completed by Fall 2026</w:t>
+        <w:t xml:space="preserve">Presented at </w:t>
+      </w:r>
+      <w:r>
+        <w:rPr>
+          <w:rFonts w:ascii="Times New Roman" w:hAnsi="Times New Roman" w:cs="Times New Roman"/>
+          <w:sz w:val="28"/>
+          <w:szCs w:val="28"/>
+        </w:rPr>
+        <w:t>Baruch College, CUFE, PKU-NSD, Fudan University, Hong Kong Polytechnic University, University of Macau, and University of South Carolina</w:t>
+      </w:r>
+    </w:p>
+    <w:p>
+      <w:pPr>
+        <w:spacing w:after="0" w:line="240" w:lineRule="auto"/>
+        <w:rPr>
+          <w:rFonts w:ascii="Times New Roman" w:hAnsi="Times New Roman" w:cs="Times New Roman"/>
+          <w:b/>
+          <w:bCs/>
+          <w:sz w:val="28"/>
+          <w:szCs w:val="28"/>
+        </w:rPr>
+      </w:pPr>
+    </w:p>
+    <w:p>
+      <w:pPr>
+        <w:spacing w:after="0" w:line="240" w:lineRule="auto"/>
+        <w:rPr>
+          <w:rFonts w:ascii="Times New Roman" w:hAnsi="Times New Roman" w:cs="Times New Roman"/>
+          <w:sz w:val="28"/>
+          <w:szCs w:val="28"/>
+        </w:rPr>
+      </w:pPr>
+      <w:r>
+        <w:rPr>
+          <w:rFonts w:ascii="Times New Roman" w:hAnsi="Times New Roman" w:cs="Times New Roman"/>
+          <w:b/>
+          <w:bCs/>
+          <w:sz w:val="28"/>
+          <w:szCs w:val="28"/>
+        </w:rPr>
+        <w:t>Using a Sandboxed Ticketing Bot to Teach Digital Trust and IT Audit</w:t>
+      </w:r>
+      <w:r>
+        <w:rPr>
+          <w:rFonts w:ascii="Times New Roman" w:hAnsi="Times New Roman" w:cs="Times New Roman"/>
+          <w:sz w:val="28"/>
+          <w:szCs w:val="28"/>
+        </w:rPr>
+        <w:t xml:space="preserve"> with Lorraine Lee</w:t>
+      </w:r>
+      <w:r>
+        <w:rPr>
+          <w:rFonts w:ascii="Times New Roman" w:hAnsi="Times New Roman" w:cs="Times New Roman"/>
+          <w:sz w:val="28"/>
+          <w:szCs w:val="28"/>
+        </w:rPr>
+        <w:t xml:space="preserve"> (UNC Wilmington)</w:t>
+      </w:r>
+      <w:r>
+        <w:rPr>
+          <w:rFonts w:ascii="Times New Roman" w:hAnsi="Times New Roman" w:cs="Times New Roman"/>
+          <w:sz w:val="28"/>
+          <w:szCs w:val="28"/>
+        </w:rPr>
+        <w:t>, Hagit Levy-Shalev (Baruch), Shantel Deleon (EY)</w:t>
       </w:r>
     </w:p>
     <w:p>
@@ -1201,7 +1087,7 @@
           <w:sz w:val="28"/>
           <w:szCs w:val="28"/>
         </w:rPr>
-        <w:t>To submit to AAA Joint Midyear Meeting of the AIS Section</w:t>
+        <w:t>IRB approved and completed</w:t>
       </w:r>
     </w:p>
     <w:p>
@@ -1224,100 +1110,15 @@
           <w:sz w:val="28"/>
           <w:szCs w:val="28"/>
         </w:rPr>
-        <w:t>To submit to Issues in Accounting Education</w:t>
-      </w:r>
-    </w:p>
-    <w:p>
-      <w:pPr>
-        <w:spacing w:after="0" w:line="240" w:lineRule="auto"/>
-        <w:rPr>
-          <w:rFonts w:ascii="Times New Roman" w:hAnsi="Times New Roman" w:cs="Times New Roman"/>
-          <w:b/>
-          <w:bCs/>
-          <w:sz w:val="28"/>
-          <w:szCs w:val="28"/>
-        </w:rPr>
-      </w:pPr>
-    </w:p>
-    <w:p>
-      <w:pPr>
-        <w:spacing w:after="0" w:line="240" w:lineRule="auto"/>
-        <w:rPr>
-          <w:rFonts w:ascii="Times New Roman" w:hAnsi="Times New Roman" w:cs="Times New Roman"/>
-          <w:sz w:val="28"/>
-          <w:szCs w:val="28"/>
-        </w:rPr>
-      </w:pPr>
-      <w:r>
-        <w:rPr>
-          <w:rFonts w:ascii="Times New Roman" w:hAnsi="Times New Roman" w:cs="Times New Roman"/>
-          <w:b/>
-          <w:bCs/>
-          <w:sz w:val="28"/>
-          <w:szCs w:val="28"/>
-        </w:rPr>
-        <w:lastRenderedPageBreak/>
-        <w:t>Scalable Data Analytics Pedagogy in Accounting: Randomized Case Studies and Automated Assessment</w:t>
-      </w:r>
-      <w:r>
-        <w:rPr>
-          <w:rFonts w:ascii="Times New Roman" w:hAnsi="Times New Roman" w:cs="Times New Roman"/>
-          <w:b/>
-          <w:bCs/>
-          <w:sz w:val="28"/>
-          <w:szCs w:val="28"/>
-        </w:rPr>
-        <w:t xml:space="preserve"> </w:t>
-      </w:r>
-      <w:r>
-        <w:rPr>
-          <w:rFonts w:ascii="Times New Roman" w:hAnsi="Times New Roman" w:cs="Times New Roman"/>
-          <w:sz w:val="28"/>
-          <w:szCs w:val="28"/>
-        </w:rPr>
-        <w:t xml:space="preserve">with </w:t>
-      </w:r>
-      <w:proofErr w:type="spellStart"/>
-      <w:r>
-        <w:rPr>
-          <w:rFonts w:ascii="Times New Roman" w:hAnsi="Times New Roman" w:cs="Times New Roman"/>
-          <w:sz w:val="28"/>
-          <w:szCs w:val="28"/>
-        </w:rPr>
-        <w:t>Hagit</w:t>
-      </w:r>
-      <w:proofErr w:type="spellEnd"/>
-      <w:r>
-        <w:rPr>
-          <w:rFonts w:ascii="Times New Roman" w:hAnsi="Times New Roman" w:cs="Times New Roman"/>
-          <w:sz w:val="28"/>
-          <w:szCs w:val="28"/>
-        </w:rPr>
-        <w:t xml:space="preserve"> Levy-Shalev</w:t>
-      </w:r>
-      <w:r>
-        <w:rPr>
-          <w:rFonts w:ascii="Times New Roman" w:hAnsi="Times New Roman" w:cs="Times New Roman"/>
-          <w:sz w:val="28"/>
-          <w:szCs w:val="28"/>
-        </w:rPr>
-        <w:t xml:space="preserve"> (Baruch)</w:t>
-      </w:r>
-      <w:r>
-        <w:rPr>
-          <w:rFonts w:ascii="Times New Roman" w:hAnsi="Times New Roman" w:cs="Times New Roman"/>
-          <w:sz w:val="28"/>
-          <w:szCs w:val="28"/>
-        </w:rPr>
-        <w:t>, Carol Marquardt</w:t>
-      </w:r>
-      <w:r>
-        <w:rPr>
-          <w:rFonts w:ascii="Times New Roman" w:hAnsi="Times New Roman" w:cs="Times New Roman"/>
-          <w:sz w:val="28"/>
-          <w:szCs w:val="28"/>
-        </w:rPr>
-        <w:t xml:space="preserve"> (Baruch)</w:t>
+        <w:t>Submitted</w:t>
+      </w:r>
+      <w:r>
+        <w:rPr>
+          <w:rFonts w:ascii="Times New Roman" w:hAnsi="Times New Roman" w:cs="Times New Roman"/>
+          <w:sz w:val="28"/>
+          <w:szCs w:val="28"/>
+        </w:rPr>
+        <w:t xml:space="preserve"> to AAA Joint Midyear Meeting of the AIS Section</w:t>
       </w:r>
     </w:p>
     <w:p>
@@ -1340,15 +1141,81 @@
           <w:sz w:val="28"/>
           <w:szCs w:val="28"/>
         </w:rPr>
-        <w:t>IRB Approved</w:t>
-      </w:r>
-      <w:r>
-        <w:rPr>
-          <w:rFonts w:ascii="Times New Roman" w:hAnsi="Times New Roman" w:cs="Times New Roman"/>
-          <w:sz w:val="28"/>
-          <w:szCs w:val="28"/>
-        </w:rPr>
-        <w:t xml:space="preserve"> - To be completed by Summer 2026</w:t>
+        <w:t>To submit to Issues in Accounting Education</w:t>
+      </w:r>
+    </w:p>
+    <w:p>
+      <w:pPr>
+        <w:spacing w:after="0" w:line="240" w:lineRule="auto"/>
+        <w:rPr>
+          <w:rFonts w:ascii="Times New Roman" w:hAnsi="Times New Roman" w:cs="Times New Roman"/>
+          <w:b/>
+          <w:bCs/>
+          <w:sz w:val="28"/>
+          <w:szCs w:val="28"/>
+        </w:rPr>
+      </w:pPr>
+    </w:p>
+    <w:p>
+      <w:pPr>
+        <w:spacing w:after="0" w:line="240" w:lineRule="auto"/>
+        <w:rPr>
+          <w:rFonts w:ascii="Times New Roman" w:hAnsi="Times New Roman" w:cs="Times New Roman"/>
+          <w:sz w:val="28"/>
+          <w:szCs w:val="28"/>
+        </w:rPr>
+      </w:pPr>
+      <w:r>
+        <w:rPr>
+          <w:rFonts w:ascii="Times New Roman" w:hAnsi="Times New Roman" w:cs="Times New Roman"/>
+          <w:b/>
+          <w:bCs/>
+          <w:sz w:val="28"/>
+          <w:szCs w:val="28"/>
+        </w:rPr>
+        <w:t>Scalable Data Analytics Pedagogy in Accounting: Randomized Case Studies and Automated Assessment</w:t>
+      </w:r>
+      <w:r>
+        <w:rPr>
+          <w:rFonts w:ascii="Times New Roman" w:hAnsi="Times New Roman" w:cs="Times New Roman"/>
+          <w:b/>
+          <w:bCs/>
+          <w:sz w:val="28"/>
+          <w:szCs w:val="28"/>
+        </w:rPr>
+        <w:t xml:space="preserve"> </w:t>
+      </w:r>
+      <w:r>
+        <w:rPr>
+          <w:rFonts w:ascii="Times New Roman" w:hAnsi="Times New Roman" w:cs="Times New Roman"/>
+          <w:sz w:val="28"/>
+          <w:szCs w:val="28"/>
+        </w:rPr>
+        <w:t>with Hagit Levy-Shalev</w:t>
+      </w:r>
+      <w:r>
+        <w:rPr>
+          <w:rFonts w:ascii="Times New Roman" w:hAnsi="Times New Roman" w:cs="Times New Roman"/>
+          <w:sz w:val="28"/>
+          <w:szCs w:val="28"/>
+        </w:rPr>
+        <w:t xml:space="preserve"> (Baruch)</w:t>
+      </w:r>
+      <w:r>
+        <w:rPr>
+          <w:rFonts w:ascii="Times New Roman" w:hAnsi="Times New Roman" w:cs="Times New Roman"/>
+          <w:sz w:val="28"/>
+          <w:szCs w:val="28"/>
+        </w:rPr>
+        <w:t>, Carol Marquardt</w:t>
+      </w:r>
+      <w:r>
+        <w:rPr>
+          <w:rFonts w:ascii="Times New Roman" w:hAnsi="Times New Roman" w:cs="Times New Roman"/>
+          <w:sz w:val="28"/>
+          <w:szCs w:val="28"/>
+        </w:rPr>
+        <w:t xml:space="preserve"> (Baruch)</w:t>
       </w:r>
     </w:p>
     <w:p>
@@ -1371,109 +1238,7 @@
           <w:sz w:val="28"/>
           <w:szCs w:val="28"/>
         </w:rPr>
-        <w:t xml:space="preserve">To submit to Journal of Accounting </w:t>
-      </w:r>
-      <w:r>
-        <w:rPr>
-          <w:rFonts w:ascii="Times New Roman" w:hAnsi="Times New Roman" w:cs="Times New Roman"/>
-          <w:sz w:val="28"/>
-          <w:szCs w:val="28"/>
-        </w:rPr>
-        <w:t>Education</w:t>
-      </w:r>
-    </w:p>
-    <w:p>
-      <w:pPr>
-        <w:spacing w:after="0" w:line="240" w:lineRule="auto"/>
-        <w:rPr>
-          <w:rFonts w:ascii="Times New Roman" w:hAnsi="Times New Roman" w:cs="Times New Roman"/>
-          <w:b/>
-          <w:bCs/>
-          <w:sz w:val="28"/>
-          <w:szCs w:val="28"/>
-        </w:rPr>
-      </w:pPr>
-    </w:p>
-    <w:p>
-      <w:pPr>
-        <w:spacing w:after="0" w:line="240" w:lineRule="auto"/>
-        <w:rPr>
-          <w:rFonts w:ascii="Times New Roman" w:hAnsi="Times New Roman" w:cs="Times New Roman"/>
-          <w:sz w:val="28"/>
-          <w:szCs w:val="28"/>
-        </w:rPr>
-      </w:pPr>
-      <w:r>
-        <w:rPr>
-          <w:rFonts w:ascii="Times New Roman" w:hAnsi="Times New Roman" w:cs="Times New Roman"/>
-          <w:b/>
-          <w:bCs/>
-          <w:sz w:val="28"/>
-          <w:szCs w:val="28"/>
-        </w:rPr>
-        <w:t>Why is it so hard to find a job now? Enter Ghost Jobs</w:t>
-      </w:r>
-      <w:r>
-        <w:rPr>
-          <w:rFonts w:ascii="Times New Roman" w:hAnsi="Times New Roman" w:cs="Times New Roman"/>
-          <w:sz w:val="28"/>
-          <w:szCs w:val="28"/>
-        </w:rPr>
-        <w:t xml:space="preserve"> with </w:t>
-      </w:r>
-      <w:proofErr w:type="spellStart"/>
-      <w:r>
-        <w:rPr>
-          <w:rFonts w:ascii="Times New Roman" w:hAnsi="Times New Roman" w:cs="Times New Roman"/>
-          <w:sz w:val="28"/>
-          <w:szCs w:val="28"/>
-        </w:rPr>
-        <w:t>Loujaina</w:t>
-      </w:r>
-      <w:proofErr w:type="spellEnd"/>
-      <w:r>
-        <w:rPr>
-          <w:rFonts w:ascii="Times New Roman" w:hAnsi="Times New Roman" w:cs="Times New Roman"/>
-          <w:sz w:val="28"/>
-          <w:szCs w:val="28"/>
-        </w:rPr>
-        <w:t xml:space="preserve"> </w:t>
-      </w:r>
-      <w:proofErr w:type="spellStart"/>
-      <w:r>
-        <w:rPr>
-          <w:rFonts w:ascii="Times New Roman" w:hAnsi="Times New Roman" w:cs="Times New Roman"/>
-          <w:sz w:val="28"/>
-          <w:szCs w:val="28"/>
-        </w:rPr>
-        <w:t>Abdelwahed</w:t>
-      </w:r>
-      <w:proofErr w:type="spellEnd"/>
-      <w:r>
-        <w:rPr>
-          <w:rFonts w:ascii="Times New Roman" w:hAnsi="Times New Roman" w:cs="Times New Roman"/>
-          <w:sz w:val="28"/>
-          <w:szCs w:val="28"/>
-        </w:rPr>
-        <w:t xml:space="preserve"> (</w:t>
-      </w:r>
-      <w:proofErr w:type="spellStart"/>
-      <w:r>
-        <w:rPr>
-          <w:rFonts w:ascii="Times New Roman" w:hAnsi="Times New Roman" w:cs="Times New Roman"/>
-          <w:sz w:val="28"/>
-          <w:szCs w:val="28"/>
-        </w:rPr>
-        <w:t>Revelio</w:t>
-      </w:r>
-      <w:proofErr w:type="spellEnd"/>
-      <w:r>
-        <w:rPr>
-          <w:rFonts w:ascii="Times New Roman" w:hAnsi="Times New Roman" w:cs="Times New Roman"/>
-          <w:sz w:val="28"/>
-          <w:szCs w:val="28"/>
-        </w:rPr>
-        <w:t xml:space="preserve"> Labs), Yen Tong (Nanyang Technological University)</w:t>
+        <w:t>IRB approved and completed</w:t>
       </w:r>
     </w:p>
     <w:p>
@@ -1496,53 +1261,55 @@
           <w:sz w:val="28"/>
           <w:szCs w:val="28"/>
         </w:rPr>
-        <w:t xml:space="preserve">To submit to </w:t>
-      </w:r>
-      <w:r>
-        <w:rPr>
-          <w:rFonts w:ascii="Times New Roman" w:hAnsi="Times New Roman" w:cs="Times New Roman"/>
-          <w:sz w:val="28"/>
-          <w:szCs w:val="28"/>
-        </w:rPr>
-        <w:t>Management Science</w:t>
-      </w:r>
-    </w:p>
-    <w:p>
-      <w:pPr>
-        <w:spacing w:after="0" w:line="240" w:lineRule="auto"/>
-        <w:rPr>
-          <w:rFonts w:ascii="Times New Roman" w:hAnsi="Times New Roman" w:cs="Times New Roman"/>
-          <w:sz w:val="28"/>
-          <w:szCs w:val="28"/>
-        </w:rPr>
-      </w:pPr>
-    </w:p>
-    <w:p>
-      <w:pPr>
-        <w:spacing w:after="0" w:line="240" w:lineRule="auto"/>
-        <w:rPr>
-          <w:rFonts w:ascii="Times New Roman" w:hAnsi="Times New Roman" w:cs="Times New Roman"/>
-          <w:sz w:val="28"/>
-          <w:szCs w:val="28"/>
-        </w:rPr>
-      </w:pPr>
-      <w:r>
-        <w:rPr>
-          <w:rFonts w:ascii="Times New Roman" w:hAnsi="Times New Roman" w:cs="Times New Roman"/>
-          <w:b/>
-          <w:bCs/>
-          <w:sz w:val="28"/>
-          <w:szCs w:val="28"/>
-        </w:rPr>
-        <w:t>Information or Institution? AI's Role in Expert Testimony</w:t>
-      </w:r>
-      <w:r>
-        <w:rPr>
-          <w:rFonts w:ascii="Times New Roman" w:hAnsi="Times New Roman" w:cs="Times New Roman"/>
-          <w:sz w:val="28"/>
-          <w:szCs w:val="28"/>
-        </w:rPr>
-        <w:t xml:space="preserve"> with Shou-Ming Chang (Graduate Center)</w:t>
+        <w:t xml:space="preserve">To submit to Journal of Accounting </w:t>
+      </w:r>
+      <w:r>
+        <w:rPr>
+          <w:rFonts w:ascii="Times New Roman" w:hAnsi="Times New Roman" w:cs="Times New Roman"/>
+          <w:sz w:val="28"/>
+          <w:szCs w:val="28"/>
+        </w:rPr>
+        <w:t>Education</w:t>
+      </w:r>
+    </w:p>
+    <w:p>
+      <w:pPr>
+        <w:spacing w:after="0" w:line="240" w:lineRule="auto"/>
+        <w:rPr>
+          <w:rFonts w:ascii="Times New Roman" w:hAnsi="Times New Roman" w:cs="Times New Roman"/>
+          <w:b/>
+          <w:bCs/>
+          <w:sz w:val="28"/>
+          <w:szCs w:val="28"/>
+        </w:rPr>
+      </w:pPr>
+    </w:p>
+    <w:p>
+      <w:pPr>
+        <w:spacing w:after="0" w:line="240" w:lineRule="auto"/>
+        <w:rPr>
+          <w:rFonts w:ascii="Times New Roman" w:hAnsi="Times New Roman" w:cs="Times New Roman"/>
+          <w:sz w:val="28"/>
+          <w:szCs w:val="28"/>
+        </w:rPr>
+      </w:pPr>
+      <w:r>
+        <w:rPr>
+          <w:rFonts w:ascii="Times New Roman" w:hAnsi="Times New Roman" w:cs="Times New Roman"/>
+          <w:b/>
+          <w:bCs/>
+          <w:sz w:val="28"/>
+          <w:szCs w:val="28"/>
+        </w:rPr>
+        <w:t>Why is it so hard to find a job now? Enter Ghost Jobs</w:t>
+      </w:r>
+      <w:r>
+        <w:rPr>
+          <w:rFonts w:ascii="Times New Roman" w:hAnsi="Times New Roman" w:cs="Times New Roman"/>
+          <w:sz w:val="28"/>
+          <w:szCs w:val="28"/>
+        </w:rPr>
+        <w:t xml:space="preserve"> with Loujaina Abdelwahed (Revelio Labs), Yen Tong (Nanyang Technological University)</w:t>
       </w:r>
     </w:p>
     <w:p>
@@ -1565,87 +1332,53 @@
           <w:sz w:val="28"/>
           <w:szCs w:val="28"/>
         </w:rPr>
-        <w:t>Submitted to Journal of Law and Economics (June 2026)</w:t>
-      </w:r>
-    </w:p>
-    <w:p>
-      <w:pPr>
-        <w:spacing w:after="0" w:line="240" w:lineRule="auto"/>
-        <w:rPr>
-          <w:rFonts w:ascii="Times New Roman" w:hAnsi="Times New Roman" w:cs="Times New Roman"/>
-          <w:sz w:val="28"/>
-          <w:szCs w:val="28"/>
-        </w:rPr>
-      </w:pPr>
-    </w:p>
-    <w:p>
-      <w:pPr>
-        <w:spacing w:after="0" w:line="240" w:lineRule="auto"/>
-        <w:rPr>
-          <w:rFonts w:ascii="Times New Roman" w:hAnsi="Times New Roman" w:cs="Times New Roman"/>
-          <w:sz w:val="28"/>
-          <w:szCs w:val="28"/>
-        </w:rPr>
-      </w:pPr>
-      <w:r>
-        <w:rPr>
-          <w:rFonts w:ascii="Times New Roman" w:hAnsi="Times New Roman" w:cs="Times New Roman"/>
-          <w:b/>
-          <w:bCs/>
-          <w:sz w:val="28"/>
-          <w:szCs w:val="28"/>
-        </w:rPr>
-        <w:t>Escrows on the Dark Web</w:t>
-      </w:r>
-      <w:r>
-        <w:rPr>
-          <w:rFonts w:ascii="Times New Roman" w:hAnsi="Times New Roman" w:cs="Times New Roman"/>
-          <w:sz w:val="28"/>
-          <w:szCs w:val="28"/>
-        </w:rPr>
-        <w:t xml:space="preserve"> with </w:t>
-      </w:r>
-      <w:r>
-        <w:rPr>
-          <w:rFonts w:ascii="Times New Roman" w:hAnsi="Times New Roman" w:cs="Times New Roman"/>
-          <w:sz w:val="28"/>
-          <w:szCs w:val="28"/>
-        </w:rPr>
-        <w:t>Yen Tong</w:t>
-      </w:r>
-      <w:r>
-        <w:rPr>
-          <w:rFonts w:ascii="Times New Roman" w:hAnsi="Times New Roman" w:cs="Times New Roman"/>
-          <w:sz w:val="28"/>
-          <w:szCs w:val="28"/>
-        </w:rPr>
-        <w:t xml:space="preserve"> (</w:t>
-      </w:r>
-      <w:r>
-        <w:rPr>
-          <w:rFonts w:ascii="Times New Roman" w:hAnsi="Times New Roman" w:cs="Times New Roman"/>
-          <w:sz w:val="28"/>
-          <w:szCs w:val="28"/>
-        </w:rPr>
-        <w:t xml:space="preserve">Nanyang Technological University), </w:t>
-      </w:r>
-      <w:proofErr w:type="spellStart"/>
-      <w:r>
-        <w:rPr>
-          <w:rFonts w:ascii="Times New Roman" w:hAnsi="Times New Roman" w:cs="Times New Roman"/>
-          <w:sz w:val="28"/>
-          <w:szCs w:val="28"/>
-        </w:rPr>
-        <w:t>Hagit</w:t>
-      </w:r>
-      <w:proofErr w:type="spellEnd"/>
-      <w:r>
-        <w:rPr>
-          <w:rFonts w:ascii="Times New Roman" w:hAnsi="Times New Roman" w:cs="Times New Roman"/>
-          <w:sz w:val="28"/>
-          <w:szCs w:val="28"/>
-        </w:rPr>
-        <w:t xml:space="preserve"> Levy-Shalev (Baruch)</w:t>
+        <w:t xml:space="preserve">To submit to </w:t>
+      </w:r>
+      <w:r>
+        <w:rPr>
+          <w:rFonts w:ascii="Times New Roman" w:hAnsi="Times New Roman" w:cs="Times New Roman"/>
+          <w:sz w:val="28"/>
+          <w:szCs w:val="28"/>
+        </w:rPr>
+        <w:t>Management Science</w:t>
+      </w:r>
+    </w:p>
+    <w:p>
+      <w:pPr>
+        <w:spacing w:after="0" w:line="240" w:lineRule="auto"/>
+        <w:rPr>
+          <w:rFonts w:ascii="Times New Roman" w:hAnsi="Times New Roman" w:cs="Times New Roman"/>
+          <w:sz w:val="28"/>
+          <w:szCs w:val="28"/>
+        </w:rPr>
+      </w:pPr>
+    </w:p>
+    <w:p>
+      <w:pPr>
+        <w:spacing w:after="0" w:line="240" w:lineRule="auto"/>
+        <w:rPr>
+          <w:rFonts w:ascii="Times New Roman" w:hAnsi="Times New Roman" w:cs="Times New Roman"/>
+          <w:sz w:val="28"/>
+          <w:szCs w:val="28"/>
+        </w:rPr>
+      </w:pPr>
+      <w:r>
+        <w:rPr>
+          <w:rFonts w:ascii="Times New Roman" w:hAnsi="Times New Roman" w:cs="Times New Roman"/>
+          <w:b/>
+          <w:bCs/>
+          <w:sz w:val="28"/>
+          <w:szCs w:val="28"/>
+        </w:rPr>
+        <w:t>Information or Institution? AI's Role in Expert Testimony</w:t>
+      </w:r>
+      <w:r>
+        <w:rPr>
+          <w:rFonts w:ascii="Times New Roman" w:hAnsi="Times New Roman" w:cs="Times New Roman"/>
+          <w:sz w:val="28"/>
+          <w:szCs w:val="28"/>
+        </w:rPr>
+        <w:t xml:space="preserve"> with Shou-Ming Chang (Graduate Center)</w:t>
       </w:r>
     </w:p>
     <w:p>
@@ -1668,71 +1401,7 @@
           <w:sz w:val="28"/>
           <w:szCs w:val="28"/>
         </w:rPr>
-        <w:t xml:space="preserve">Submitted to </w:t>
-      </w:r>
-      <w:r>
-        <w:rPr>
-          <w:rFonts w:ascii="Times New Roman" w:hAnsi="Times New Roman" w:cs="Times New Roman"/>
-          <w:sz w:val="28"/>
-          <w:szCs w:val="28"/>
-        </w:rPr>
-        <w:t>Information Systems Research</w:t>
-      </w:r>
-      <w:r>
-        <w:rPr>
-          <w:rFonts w:ascii="Times New Roman" w:hAnsi="Times New Roman" w:cs="Times New Roman"/>
-          <w:sz w:val="28"/>
-          <w:szCs w:val="28"/>
-        </w:rPr>
-        <w:t xml:space="preserve"> (Ju</w:t>
-      </w:r>
-      <w:r>
-        <w:rPr>
-          <w:rFonts w:ascii="Times New Roman" w:hAnsi="Times New Roman" w:cs="Times New Roman"/>
-          <w:sz w:val="28"/>
-          <w:szCs w:val="28"/>
-        </w:rPr>
-        <w:t>ly</w:t>
-      </w:r>
-      <w:r>
-        <w:rPr>
-          <w:rFonts w:ascii="Times New Roman" w:hAnsi="Times New Roman" w:cs="Times New Roman"/>
-          <w:sz w:val="28"/>
-          <w:szCs w:val="28"/>
-        </w:rPr>
-        <w:t xml:space="preserve"> 2026)</w:t>
-      </w:r>
-    </w:p>
-    <w:p>
-      <w:pPr>
-        <w:spacing w:after="0" w:line="240" w:lineRule="auto"/>
-        <w:rPr>
-          <w:rFonts w:ascii="Times New Roman" w:hAnsi="Times New Roman" w:cs="Times New Roman"/>
-          <w:sz w:val="28"/>
-          <w:szCs w:val="28"/>
-        </w:rPr>
-      </w:pPr>
-    </w:p>
-    <w:p>
-      <w:pPr>
-        <w:spacing w:after="0" w:line="240" w:lineRule="auto"/>
-        <w:rPr>
-          <w:rFonts w:ascii="Times New Roman" w:hAnsi="Times New Roman" w:cs="Times New Roman"/>
-          <w:b/>
-          <w:bCs/>
-          <w:sz w:val="28"/>
-          <w:szCs w:val="28"/>
-        </w:rPr>
-      </w:pPr>
-      <w:r>
-        <w:rPr>
-          <w:rFonts w:ascii="Times New Roman" w:hAnsi="Times New Roman" w:cs="Times New Roman"/>
-          <w:b/>
-          <w:bCs/>
-          <w:sz w:val="28"/>
-          <w:szCs w:val="28"/>
-        </w:rPr>
-        <w:t>Vine Copula VAR</w:t>
+        <w:t>Submitted to Journal of Law and Economics (June 2026)</w:t>
       </w:r>
     </w:p>
     <w:p>
@@ -1755,39 +1424,77 @@
           <w:sz w:val="28"/>
           <w:szCs w:val="28"/>
         </w:rPr>
-        <w:t>Submitted to Journal of Applied Econometrics (April 2026)</w:t>
-      </w:r>
-    </w:p>
-    <w:p>
-      <w:pPr>
-        <w:spacing w:after="0" w:line="240" w:lineRule="auto"/>
-        <w:rPr>
-          <w:rFonts w:ascii="Times New Roman" w:hAnsi="Times New Roman" w:cs="Times New Roman"/>
-          <w:sz w:val="28"/>
-          <w:szCs w:val="28"/>
-        </w:rPr>
-      </w:pPr>
-    </w:p>
-    <w:p>
-      <w:pPr>
-        <w:spacing w:after="0" w:line="240" w:lineRule="auto"/>
-        <w:rPr>
-          <w:rFonts w:ascii="Times New Roman" w:hAnsi="Times New Roman" w:cs="Times New Roman"/>
-          <w:b/>
-          <w:bCs/>
-          <w:sz w:val="28"/>
-          <w:szCs w:val="28"/>
-        </w:rPr>
-      </w:pPr>
-      <w:r>
-        <w:rPr>
-          <w:rFonts w:ascii="Times New Roman" w:hAnsi="Times New Roman" w:cs="Times New Roman"/>
-          <w:b/>
-          <w:bCs/>
-          <w:sz w:val="28"/>
-          <w:szCs w:val="28"/>
-        </w:rPr>
-        <w:t>Secularization of Curses by LLM Guardrails</w:t>
+        <w:t xml:space="preserve">To present at </w:t>
+      </w:r>
+      <w:r>
+        <w:rPr>
+          <w:rFonts w:ascii="Times New Roman" w:hAnsi="Times New Roman" w:cs="Times New Roman"/>
+          <w:sz w:val="28"/>
+          <w:szCs w:val="28"/>
+        </w:rPr>
+        <w:t>SovereignAI ACL Workshop September 2026</w:t>
+      </w:r>
+    </w:p>
+    <w:p>
+      <w:pPr>
+        <w:spacing w:after="0" w:line="240" w:lineRule="auto"/>
+        <w:rPr>
+          <w:rFonts w:ascii="Times New Roman" w:hAnsi="Times New Roman" w:cs="Times New Roman"/>
+          <w:sz w:val="28"/>
+          <w:szCs w:val="28"/>
+        </w:rPr>
+      </w:pPr>
+    </w:p>
+    <w:p>
+      <w:pPr>
+        <w:spacing w:after="0" w:line="240" w:lineRule="auto"/>
+        <w:rPr>
+          <w:rFonts w:ascii="Times New Roman" w:hAnsi="Times New Roman" w:cs="Times New Roman"/>
+          <w:sz w:val="28"/>
+          <w:szCs w:val="28"/>
+        </w:rPr>
+      </w:pPr>
+      <w:r>
+        <w:rPr>
+          <w:rFonts w:ascii="Times New Roman" w:hAnsi="Times New Roman" w:cs="Times New Roman"/>
+          <w:b/>
+          <w:bCs/>
+          <w:sz w:val="28"/>
+          <w:szCs w:val="28"/>
+        </w:rPr>
+        <w:t>Escrows on the Dark Web</w:t>
+      </w:r>
+      <w:r>
+        <w:rPr>
+          <w:rFonts w:ascii="Times New Roman" w:hAnsi="Times New Roman" w:cs="Times New Roman"/>
+          <w:sz w:val="28"/>
+          <w:szCs w:val="28"/>
+        </w:rPr>
+        <w:t xml:space="preserve"> with </w:t>
+      </w:r>
+      <w:r>
+        <w:rPr>
+          <w:rFonts w:ascii="Times New Roman" w:hAnsi="Times New Roman" w:cs="Times New Roman"/>
+          <w:sz w:val="28"/>
+          <w:szCs w:val="28"/>
+        </w:rPr>
+        <w:t>Yen Tong</w:t>
+      </w:r>
+      <w:r>
+        <w:rPr>
+          <w:rFonts w:ascii="Times New Roman" w:hAnsi="Times New Roman" w:cs="Times New Roman"/>
+          <w:sz w:val="28"/>
+          <w:szCs w:val="28"/>
+        </w:rPr>
+        <w:t xml:space="preserve"> (</w:t>
+      </w:r>
+      <w:r>
+        <w:rPr>
+          <w:rFonts w:ascii="Times New Roman" w:hAnsi="Times New Roman" w:cs="Times New Roman"/>
+          <w:sz w:val="28"/>
+          <w:szCs w:val="28"/>
+        </w:rPr>
+        <w:t>Nanyang Technological University), Hagit Levy-Shalev (Baruch)</w:t>
       </w:r>
     </w:p>
     <w:p>
@@ -1810,57 +1517,79 @@
           <w:sz w:val="28"/>
           <w:szCs w:val="28"/>
         </w:rPr>
-        <w:t xml:space="preserve">Submitted </w:t>
-      </w:r>
-      <w:r>
-        <w:rPr>
-          <w:rFonts w:ascii="Times New Roman" w:hAnsi="Times New Roman" w:cs="Times New Roman"/>
-          <w:sz w:val="28"/>
-          <w:szCs w:val="28"/>
-        </w:rPr>
-        <w:t>to Magic, Ritual and Witchcraft with Editor endorsement</w:t>
-      </w:r>
-      <w:r>
-        <w:rPr>
-          <w:rFonts w:ascii="Times New Roman" w:hAnsi="Times New Roman" w:cs="Times New Roman"/>
-          <w:sz w:val="28"/>
-          <w:szCs w:val="28"/>
-        </w:rPr>
-        <w:t xml:space="preserve"> (July 2026)</w:t>
-      </w:r>
-    </w:p>
-    <w:p>
-      <w:pPr>
-        <w:spacing w:after="0" w:line="240" w:lineRule="auto"/>
-        <w:rPr>
-          <w:rFonts w:ascii="Times New Roman" w:hAnsi="Times New Roman" w:cs="Times New Roman"/>
-          <w:b/>
-          <w:bCs/>
-          <w:sz w:val="28"/>
-          <w:szCs w:val="28"/>
-        </w:rPr>
-      </w:pPr>
-    </w:p>
-    <w:p>
-      <w:pPr>
-        <w:spacing w:after="0" w:line="240" w:lineRule="auto"/>
-        <w:rPr>
-          <w:rFonts w:ascii="Times New Roman" w:hAnsi="Times New Roman" w:cs="Times New Roman"/>
-          <w:b/>
-          <w:bCs/>
-          <w:sz w:val="28"/>
-          <w:szCs w:val="28"/>
-        </w:rPr>
-      </w:pPr>
-      <w:r>
-        <w:rPr>
-          <w:rFonts w:ascii="Times New Roman" w:hAnsi="Times New Roman" w:cs="Times New Roman"/>
-          <w:b/>
-          <w:bCs/>
-          <w:sz w:val="28"/>
-          <w:szCs w:val="28"/>
-        </w:rPr>
-        <w:t>Legitimacy and the Fluid Singaporean Welfare State</w:t>
+        <w:t xml:space="preserve">Submitted to </w:t>
+      </w:r>
+      <w:r>
+        <w:rPr>
+          <w:rFonts w:ascii="Times New Roman" w:hAnsi="Times New Roman" w:cs="Times New Roman"/>
+          <w:sz w:val="28"/>
+          <w:szCs w:val="28"/>
+        </w:rPr>
+        <w:t>Information Systems Research</w:t>
+      </w:r>
+      <w:r>
+        <w:rPr>
+          <w:rFonts w:ascii="Times New Roman" w:hAnsi="Times New Roman" w:cs="Times New Roman"/>
+          <w:sz w:val="28"/>
+          <w:szCs w:val="28"/>
+        </w:rPr>
+        <w:t xml:space="preserve"> </w:t>
+      </w:r>
+      <w:r>
+        <w:rPr>
+          <w:rFonts w:ascii="Times New Roman" w:hAnsi="Times New Roman" w:cs="Times New Roman"/>
+          <w:sz w:val="28"/>
+          <w:szCs w:val="28"/>
+        </w:rPr>
+        <w:t>(</w:t>
+      </w:r>
+      <w:r>
+        <w:rPr>
+          <w:rFonts w:ascii="Times New Roman" w:hAnsi="Times New Roman" w:cs="Times New Roman"/>
+          <w:sz w:val="28"/>
+          <w:szCs w:val="28"/>
+        </w:rPr>
+        <w:t>August 2026</w:t>
+      </w:r>
+      <w:r>
+        <w:rPr>
+          <w:rFonts w:ascii="Times New Roman" w:hAnsi="Times New Roman" w:cs="Times New Roman"/>
+          <w:sz w:val="28"/>
+          <w:szCs w:val="28"/>
+        </w:rPr>
+        <w:t>)</w:t>
+      </w:r>
+    </w:p>
+    <w:p>
+      <w:pPr>
+        <w:spacing w:after="0" w:line="240" w:lineRule="auto"/>
+        <w:rPr>
+          <w:rFonts w:ascii="Times New Roman" w:hAnsi="Times New Roman" w:cs="Times New Roman"/>
+          <w:sz w:val="28"/>
+          <w:szCs w:val="28"/>
+        </w:rPr>
+      </w:pPr>
+    </w:p>
+    <w:p>
+      <w:pPr>
+        <w:spacing w:after="0" w:line="240" w:lineRule="auto"/>
+        <w:rPr>
+          <w:rFonts w:ascii="Times New Roman" w:hAnsi="Times New Roman" w:cs="Times New Roman"/>
+          <w:b/>
+          <w:bCs/>
+          <w:sz w:val="28"/>
+          <w:szCs w:val="28"/>
+        </w:rPr>
+      </w:pPr>
+      <w:r>
+        <w:rPr>
+          <w:rFonts w:ascii="Times New Roman" w:hAnsi="Times New Roman" w:cs="Times New Roman"/>
+          <w:b/>
+          <w:bCs/>
+          <w:sz w:val="28"/>
+          <w:szCs w:val="28"/>
+        </w:rPr>
+        <w:t>Vine Copula VAR</w:t>
       </w:r>
     </w:p>
     <w:p>
@@ -1873,6 +1602,235 @@
         <w:spacing w:after="0" w:line="240" w:lineRule="auto"/>
         <w:rPr>
           <w:rFonts w:ascii="Times New Roman" w:hAnsi="Times New Roman" w:cs="Times New Roman"/>
+          <w:sz w:val="28"/>
+          <w:szCs w:val="28"/>
+        </w:rPr>
+      </w:pPr>
+      <w:r>
+        <w:rPr>
+          <w:rFonts w:ascii="Times New Roman" w:hAnsi="Times New Roman" w:cs="Times New Roman"/>
+          <w:sz w:val="28"/>
+          <w:szCs w:val="28"/>
+        </w:rPr>
+        <w:t>Rejected by Journal of Applied Econometrics with four referees’ feedback</w:t>
+      </w:r>
+    </w:p>
+    <w:p>
+      <w:pPr>
+        <w:pStyle w:val="ListParagraph"/>
+        <w:numPr>
+          <w:ilvl w:val="0"/>
+          <w:numId w:val="1"/>
+        </w:numPr>
+        <w:spacing w:after="0" w:line="240" w:lineRule="auto"/>
+        <w:rPr>
+          <w:rFonts w:ascii="Times New Roman" w:hAnsi="Times New Roman" w:cs="Times New Roman"/>
+          <w:sz w:val="28"/>
+          <w:szCs w:val="28"/>
+        </w:rPr>
+      </w:pPr>
+      <w:r>
+        <w:rPr>
+          <w:rFonts w:ascii="Times New Roman" w:hAnsi="Times New Roman" w:cs="Times New Roman"/>
+          <w:sz w:val="28"/>
+          <w:szCs w:val="28"/>
+        </w:rPr>
+        <w:t>To present at Midwest Econometrics Group October 2026</w:t>
+      </w:r>
+    </w:p>
+    <w:p>
+      <w:pPr>
+        <w:pStyle w:val="ListParagraph"/>
+        <w:numPr>
+          <w:ilvl w:val="0"/>
+          <w:numId w:val="1"/>
+        </w:numPr>
+        <w:spacing w:after="0" w:line="240" w:lineRule="auto"/>
+        <w:rPr>
+          <w:rFonts w:ascii="Times New Roman" w:hAnsi="Times New Roman" w:cs="Times New Roman"/>
+          <w:sz w:val="28"/>
+          <w:szCs w:val="28"/>
+        </w:rPr>
+      </w:pPr>
+      <w:r>
+        <w:rPr>
+          <w:rFonts w:ascii="Times New Roman" w:hAnsi="Times New Roman" w:cs="Times New Roman"/>
+          <w:sz w:val="28"/>
+          <w:szCs w:val="28"/>
+        </w:rPr>
+        <w:t xml:space="preserve">Submitted to </w:t>
+      </w:r>
+      <w:r>
+        <w:rPr>
+          <w:rFonts w:ascii="Times New Roman" w:hAnsi="Times New Roman" w:cs="Times New Roman"/>
+          <w:sz w:val="28"/>
+          <w:szCs w:val="28"/>
+        </w:rPr>
+        <w:t>Journal of Business &amp; Economic Statistic</w:t>
+      </w:r>
+      <w:r>
+        <w:rPr>
+          <w:rFonts w:ascii="Times New Roman" w:hAnsi="Times New Roman" w:cs="Times New Roman"/>
+          <w:sz w:val="28"/>
+          <w:szCs w:val="28"/>
+        </w:rPr>
+        <w:t>s (A</w:t>
+      </w:r>
+      <w:r>
+        <w:rPr>
+          <w:rFonts w:ascii="Times New Roman" w:hAnsi="Times New Roman" w:cs="Times New Roman"/>
+          <w:sz w:val="28"/>
+          <w:szCs w:val="28"/>
+        </w:rPr>
+        <w:t>ugust</w:t>
+      </w:r>
+      <w:r>
+        <w:rPr>
+          <w:rFonts w:ascii="Times New Roman" w:hAnsi="Times New Roman" w:cs="Times New Roman"/>
+          <w:sz w:val="28"/>
+          <w:szCs w:val="28"/>
+        </w:rPr>
+        <w:t xml:space="preserve"> 2026)</w:t>
+      </w:r>
+    </w:p>
+    <w:p>
+      <w:pPr>
+        <w:spacing w:after="0" w:line="240" w:lineRule="auto"/>
+        <w:rPr>
+          <w:rFonts w:ascii="Times New Roman" w:hAnsi="Times New Roman" w:cs="Times New Roman"/>
+          <w:sz w:val="28"/>
+          <w:szCs w:val="28"/>
+        </w:rPr>
+      </w:pPr>
+    </w:p>
+    <w:p>
+      <w:pPr>
+        <w:spacing w:after="0" w:line="240" w:lineRule="auto"/>
+        <w:rPr>
+          <w:rFonts w:ascii="Times New Roman" w:hAnsi="Times New Roman" w:cs="Times New Roman"/>
+          <w:b/>
+          <w:bCs/>
+          <w:sz w:val="28"/>
+          <w:szCs w:val="28"/>
+        </w:rPr>
+      </w:pPr>
+      <w:r>
+        <w:rPr>
+          <w:rFonts w:ascii="Times New Roman" w:hAnsi="Times New Roman" w:cs="Times New Roman"/>
+          <w:b/>
+          <w:bCs/>
+          <w:sz w:val="28"/>
+          <w:szCs w:val="28"/>
+        </w:rPr>
+        <w:t>Secularization of Curses by LLM Guardrails</w:t>
+      </w:r>
+    </w:p>
+    <w:p>
+      <w:pPr>
+        <w:pStyle w:val="ListParagraph"/>
+        <w:numPr>
+          <w:ilvl w:val="0"/>
+          <w:numId w:val="1"/>
+        </w:numPr>
+        <w:spacing w:after="0" w:line="240" w:lineRule="auto"/>
+        <w:rPr>
+          <w:rFonts w:ascii="Times New Roman" w:hAnsi="Times New Roman" w:cs="Times New Roman"/>
+          <w:sz w:val="28"/>
+          <w:szCs w:val="28"/>
+        </w:rPr>
+      </w:pPr>
+      <w:r>
+        <w:rPr>
+          <w:rFonts w:ascii="Times New Roman" w:hAnsi="Times New Roman" w:cs="Times New Roman"/>
+          <w:sz w:val="28"/>
+          <w:szCs w:val="28"/>
+        </w:rPr>
+        <w:t xml:space="preserve">Rejected by </w:t>
+      </w:r>
+      <w:r>
+        <w:rPr>
+          <w:rFonts w:ascii="Times New Roman" w:hAnsi="Times New Roman" w:cs="Times New Roman"/>
+          <w:sz w:val="28"/>
+          <w:szCs w:val="28"/>
+        </w:rPr>
+        <w:t>Magic, Ritual and Witchcraft</w:t>
+      </w:r>
+      <w:r>
+        <w:rPr>
+          <w:rFonts w:ascii="Times New Roman" w:hAnsi="Times New Roman" w:cs="Times New Roman"/>
+          <w:sz w:val="28"/>
+          <w:szCs w:val="28"/>
+        </w:rPr>
+        <w:t xml:space="preserve"> with two referees’ feedback</w:t>
+      </w:r>
+    </w:p>
+    <w:p>
+      <w:pPr>
+        <w:pStyle w:val="ListParagraph"/>
+        <w:numPr>
+          <w:ilvl w:val="0"/>
+          <w:numId w:val="1"/>
+        </w:numPr>
+        <w:spacing w:after="0" w:line="240" w:lineRule="auto"/>
+        <w:rPr>
+          <w:rFonts w:ascii="Times New Roman" w:hAnsi="Times New Roman" w:cs="Times New Roman"/>
+          <w:sz w:val="28"/>
+          <w:szCs w:val="28"/>
+        </w:rPr>
+      </w:pPr>
+      <w:r>
+        <w:rPr>
+          <w:rFonts w:ascii="Times New Roman" w:hAnsi="Times New Roman" w:cs="Times New Roman"/>
+          <w:sz w:val="28"/>
+          <w:szCs w:val="28"/>
+        </w:rPr>
+        <w:t>Submitted to AI and Society (August 2026)</w:t>
+      </w:r>
+    </w:p>
+    <w:p>
+      <w:pPr>
+        <w:spacing w:after="0" w:line="240" w:lineRule="auto"/>
+        <w:rPr>
+          <w:rFonts w:ascii="Times New Roman" w:hAnsi="Times New Roman" w:cs="Times New Roman"/>
+          <w:b/>
+          <w:bCs/>
+          <w:sz w:val="28"/>
+          <w:szCs w:val="28"/>
+        </w:rPr>
+      </w:pPr>
+    </w:p>
+    <w:p>
+      <w:pPr>
+        <w:spacing w:after="0" w:line="240" w:lineRule="auto"/>
+        <w:rPr>
+          <w:rFonts w:ascii="Times New Roman" w:hAnsi="Times New Roman" w:cs="Times New Roman"/>
+          <w:b/>
+          <w:bCs/>
+          <w:sz w:val="28"/>
+          <w:szCs w:val="28"/>
+        </w:rPr>
+      </w:pPr>
+      <w:r>
+        <w:rPr>
+          <w:rFonts w:ascii="Times New Roman" w:hAnsi="Times New Roman" w:cs="Times New Roman"/>
+          <w:b/>
+          <w:bCs/>
+          <w:sz w:val="28"/>
+          <w:szCs w:val="28"/>
+        </w:rPr>
+        <w:t>Legitimacy and the Fluid Singaporean Welfare State</w:t>
+      </w:r>
+    </w:p>
+    <w:p>
+      <w:pPr>
+        <w:pStyle w:val="ListParagraph"/>
+        <w:numPr>
+          <w:ilvl w:val="0"/>
+          <w:numId w:val="1"/>
+        </w:numPr>
+        <w:spacing w:after="0" w:line="240" w:lineRule="auto"/>
+        <w:rPr>
+          <w:rFonts w:ascii="Times New Roman" w:hAnsi="Times New Roman" w:cs="Times New Roman"/>
           <w:b/>
           <w:bCs/>
           <w:sz w:val="28"/>
@@ -1996,25 +1954,7 @@
           <w:sz w:val="28"/>
           <w:szCs w:val="28"/>
         </w:rPr>
-        <w:t xml:space="preserve">Baruch College – </w:t>
-      </w:r>
-      <w:proofErr w:type="spellStart"/>
-      <w:r>
-        <w:rPr>
-          <w:rFonts w:ascii="Times New Roman" w:hAnsi="Times New Roman" w:cs="Times New Roman"/>
-          <w:sz w:val="28"/>
-          <w:szCs w:val="28"/>
-        </w:rPr>
-        <w:t>Zicklin</w:t>
-      </w:r>
-      <w:proofErr w:type="spellEnd"/>
-      <w:r>
-        <w:rPr>
-          <w:rFonts w:ascii="Times New Roman" w:hAnsi="Times New Roman" w:cs="Times New Roman"/>
-          <w:sz w:val="28"/>
-          <w:szCs w:val="28"/>
-        </w:rPr>
-        <w:t xml:space="preserve"> Business School</w:t>
+        <w:t>Baruch College – Zicklin Business School</w:t>
       </w:r>
     </w:p>
     <w:p>
@@ -2048,16 +1988,6 @@
           <w:szCs w:val="28"/>
         </w:rPr>
       </w:pPr>
-    </w:p>
-    <w:p>
-      <w:pPr>
-        <w:spacing w:after="0" w:line="240" w:lineRule="auto"/>
-        <w:rPr>
-          <w:rFonts w:ascii="Times New Roman" w:hAnsi="Times New Roman" w:cs="Times New Roman"/>
-          <w:sz w:val="28"/>
-          <w:szCs w:val="28"/>
-        </w:rPr>
-      </w:pPr>
       <w:r>
         <w:rPr>
           <w:rFonts w:ascii="Times New Roman" w:hAnsi="Times New Roman" w:cs="Times New Roman"/>
@@ -2367,6 +2297,7 @@
           <w:sz w:val="28"/>
           <w:szCs w:val="28"/>
         </w:rPr>
+        <w:lastRenderedPageBreak/>
         <w:t>AC3202 – AIS and Data Analytics</w:t>
       </w:r>
       <w:r>
@@ -2479,9 +2410,23 @@
           <w:szCs w:val="28"/>
         </w:rPr>
       </w:pPr>
-      <w:r>
-        <w:rPr>
-          <w:rFonts w:ascii="Times New Roman" w:hAnsi="Times New Roman" w:cs="Times New Roman"/>
+    </w:p>
+    <w:p>
+      <w:pPr>
+        <w:spacing w:after="0" w:line="240" w:lineRule="auto"/>
+        <w:rPr>
+          <w:rFonts w:ascii="Times New Roman" w:hAnsi="Times New Roman" w:cs="Times New Roman"/>
+          <w:i/>
+          <w:iCs/>
+          <w:sz w:val="28"/>
+          <w:szCs w:val="28"/>
+        </w:rPr>
+      </w:pPr>
+      <w:r>
+        <w:rPr>
+          <w:rFonts w:ascii="Times New Roman" w:hAnsi="Times New Roman" w:cs="Times New Roman"/>
+          <w:i/>
+          <w:iCs/>
           <w:sz w:val="28"/>
           <w:szCs w:val="28"/>
         </w:rPr>
@@ -2497,16 +2442,6 @@
           <w:szCs w:val="28"/>
         </w:rPr>
       </w:pPr>
-    </w:p>
-    <w:p>
-      <w:pPr>
-        <w:spacing w:after="0" w:line="240" w:lineRule="auto"/>
-        <w:rPr>
-          <w:rFonts w:ascii="Times New Roman" w:hAnsi="Times New Roman" w:cs="Times New Roman"/>
-          <w:sz w:val="28"/>
-          <w:szCs w:val="28"/>
-        </w:rPr>
-      </w:pPr>
       <w:r>
         <w:rPr>
           <w:rFonts w:ascii="Times New Roman" w:hAnsi="Times New Roman" w:cs="Times New Roman"/>
@@ -2756,25 +2691,7 @@
           <w:sz w:val="28"/>
           <w:szCs w:val="28"/>
         </w:rPr>
-        <w:t xml:space="preserve">Baruch College – </w:t>
-      </w:r>
-      <w:proofErr w:type="spellStart"/>
-      <w:r>
-        <w:rPr>
-          <w:rFonts w:ascii="Times New Roman" w:hAnsi="Times New Roman" w:cs="Times New Roman"/>
-          <w:sz w:val="28"/>
-          <w:szCs w:val="28"/>
-        </w:rPr>
-        <w:t>Marxe</w:t>
-      </w:r>
-      <w:proofErr w:type="spellEnd"/>
-      <w:r>
-        <w:rPr>
-          <w:rFonts w:ascii="Times New Roman" w:hAnsi="Times New Roman" w:cs="Times New Roman"/>
-          <w:sz w:val="28"/>
-          <w:szCs w:val="28"/>
-        </w:rPr>
-        <w:t xml:space="preserve"> School</w:t>
+        <w:t>Baruch College – Marxe School</w:t>
       </w:r>
     </w:p>
     <w:p>
@@ -3536,47 +3453,7 @@
           <w:sz w:val="28"/>
           <w:szCs w:val="28"/>
         </w:rPr>
-        <w:t>ABO Conference</w:t>
-      </w:r>
-      <w:r>
-        <w:rPr>
-          <w:rFonts w:ascii="Times New Roman" w:hAnsi="Times New Roman" w:cs="Times New Roman"/>
-          <w:sz w:val="28"/>
-          <w:szCs w:val="28"/>
-        </w:rPr>
-        <w:tab/>
-      </w:r>
-      <w:r>
-        <w:rPr>
-          <w:rFonts w:ascii="Times New Roman" w:hAnsi="Times New Roman" w:cs="Times New Roman"/>
-          <w:sz w:val="28"/>
-          <w:szCs w:val="28"/>
-        </w:rPr>
-        <w:tab/>
-      </w:r>
-      <w:r>
-        <w:rPr>
-          <w:rFonts w:ascii="Times New Roman" w:hAnsi="Times New Roman" w:cs="Times New Roman"/>
-          <w:sz w:val="28"/>
-          <w:szCs w:val="28"/>
-        </w:rPr>
-        <w:tab/>
-      </w:r>
-      <w:r>
-        <w:rPr>
-          <w:rFonts w:ascii="Times New Roman" w:hAnsi="Times New Roman" w:cs="Times New Roman"/>
-          <w:sz w:val="28"/>
-          <w:szCs w:val="28"/>
-        </w:rPr>
-        <w:tab/>
-      </w:r>
-      <w:r>
-        <w:rPr>
-          <w:rFonts w:ascii="Times New Roman" w:hAnsi="Times New Roman" w:cs="Times New Roman"/>
-          <w:sz w:val="28"/>
-          <w:szCs w:val="28"/>
-        </w:rPr>
-        <w:tab/>
+        <w:t>AAA Deloitte University Doctoral Consortium</w:t>
       </w:r>
       <w:r>
         <w:rPr>
@@ -3635,65 +3512,6 @@
           <w:sz w:val="28"/>
           <w:szCs w:val="28"/>
         </w:rPr>
-        <w:t>AAA Deloitte University Doctoral Consortium</w:t>
-      </w:r>
-      <w:r>
-        <w:rPr>
-          <w:rFonts w:ascii="Times New Roman" w:hAnsi="Times New Roman" w:cs="Times New Roman"/>
-          <w:sz w:val="28"/>
-          <w:szCs w:val="28"/>
-        </w:rPr>
-        <w:tab/>
-      </w:r>
-      <w:r>
-        <w:rPr>
-          <w:rFonts w:ascii="Times New Roman" w:hAnsi="Times New Roman" w:cs="Times New Roman"/>
-          <w:sz w:val="28"/>
-          <w:szCs w:val="28"/>
-        </w:rPr>
-        <w:tab/>
-      </w:r>
-      <w:r>
-        <w:rPr>
-          <w:rFonts w:ascii="Times New Roman" w:hAnsi="Times New Roman" w:cs="Times New Roman"/>
-          <w:sz w:val="28"/>
-          <w:szCs w:val="28"/>
-        </w:rPr>
-        <w:tab/>
-      </w:r>
-      <w:r>
-        <w:rPr>
-          <w:rFonts w:ascii="Times New Roman" w:hAnsi="Times New Roman" w:cs="Times New Roman"/>
-          <w:sz w:val="28"/>
-          <w:szCs w:val="28"/>
-        </w:rPr>
-        <w:tab/>
-      </w:r>
-      <w:r>
-        <w:rPr>
-          <w:rFonts w:ascii="Times New Roman" w:hAnsi="Times New Roman" w:cs="Times New Roman"/>
-          <w:sz w:val="28"/>
-          <w:szCs w:val="28"/>
-        </w:rPr>
-        <w:tab/>
-        <w:t>2026</w:t>
-      </w:r>
-    </w:p>
-    <w:p>
-      <w:pPr>
-        <w:spacing w:after="0" w:line="240" w:lineRule="auto"/>
-        <w:rPr>
-          <w:rFonts w:ascii="Times New Roman" w:hAnsi="Times New Roman" w:cs="Times New Roman"/>
-          <w:sz w:val="28"/>
-          <w:szCs w:val="28"/>
-        </w:rPr>
-      </w:pPr>
-      <w:r>
-        <w:rPr>
-          <w:rFonts w:ascii="Times New Roman" w:hAnsi="Times New Roman" w:cs="Times New Roman"/>
-          <w:sz w:val="28"/>
-          <w:szCs w:val="28"/>
-        </w:rPr>
         <w:t>Hawaii Accounting Research Doctoral Institute</w:t>
       </w:r>
       <w:r>
@@ -4258,6 +4076,7 @@
           <w:sz w:val="28"/>
           <w:szCs w:val="28"/>
         </w:rPr>
+        <w:lastRenderedPageBreak/>
         <w:t>Management Science</w:t>
       </w:r>
       <w:r>
@@ -4363,7 +4182,6 @@
           <w:sz w:val="28"/>
           <w:szCs w:val="28"/>
         </w:rPr>
-        <w:lastRenderedPageBreak/>
         <w:t>Awards</w:t>
       </w:r>
     </w:p>
@@ -4382,6 +4200,24 @@
           <w:sz w:val="28"/>
           <w:szCs w:val="28"/>
         </w:rPr>
+        <w:t>Zicklin Dean’s Teaching Award 2025/2026</w:t>
+      </w:r>
+    </w:p>
+    <w:p>
+      <w:pPr>
+        <w:spacing w:after="0" w:line="240" w:lineRule="auto"/>
+        <w:rPr>
+          <w:rFonts w:ascii="Times New Roman" w:hAnsi="Times New Roman" w:cs="Times New Roman"/>
+          <w:sz w:val="28"/>
+          <w:szCs w:val="28"/>
+        </w:rPr>
+      </w:pPr>
+      <w:r>
+        <w:rPr>
+          <w:rFonts w:ascii="Times New Roman" w:hAnsi="Times New Roman" w:cs="Times New Roman"/>
+          <w:sz w:val="28"/>
+          <w:szCs w:val="28"/>
+        </w:rPr>
         <w:t>Mills &amp; Tannenbaum Award 2025</w:t>
       </w:r>
     </w:p>
@@ -4400,25 +4236,7 @@
           <w:sz w:val="28"/>
           <w:szCs w:val="28"/>
         </w:rPr>
-        <w:t xml:space="preserve">Donald </w:t>
-      </w:r>
-      <w:proofErr w:type="spellStart"/>
-      <w:r>
-        <w:rPr>
-          <w:rFonts w:ascii="Times New Roman" w:hAnsi="Times New Roman" w:cs="Times New Roman"/>
-          <w:sz w:val="28"/>
-          <w:szCs w:val="28"/>
-        </w:rPr>
-        <w:t>Vredenburgh</w:t>
-      </w:r>
-      <w:proofErr w:type="spellEnd"/>
-      <w:r>
-        <w:rPr>
-          <w:rFonts w:ascii="Times New Roman" w:hAnsi="Times New Roman" w:cs="Times New Roman"/>
-          <w:sz w:val="28"/>
-          <w:szCs w:val="28"/>
-        </w:rPr>
-        <w:t xml:space="preserve"> Research Grant 2025</w:t>
+        <w:t>Donald Vredenburgh Research Grant 2025</w:t>
       </w:r>
     </w:p>
     <w:p>
@@ -4698,17 +4516,8 @@
           <w:szCs w:val="28"/>
         </w:rPr>
         <w:tab/>
-      </w:r>
-      <w:proofErr w:type="spellStart"/>
-      <w:r>
-        <w:rPr>
-          <w:rFonts w:ascii="Times New Roman" w:hAnsi="Times New Roman" w:cs="Times New Roman"/>
-          <w:sz w:val="28"/>
-          <w:szCs w:val="28"/>
-        </w:rPr>
         <w:t>Singapore</w:t>
       </w:r>
-      <w:proofErr w:type="spellEnd"/>
     </w:p>
     <w:p>
       <w:pPr>
@@ -4895,17 +4704,8 @@
           <w:szCs w:val="28"/>
         </w:rPr>
         <w:tab/>
-      </w:r>
-      <w:proofErr w:type="spellStart"/>
-      <w:r>
-        <w:rPr>
-          <w:rFonts w:ascii="Times New Roman" w:hAnsi="Times New Roman" w:cs="Times New Roman"/>
-          <w:sz w:val="28"/>
-          <w:szCs w:val="28"/>
-        </w:rPr>
         <w:t>Singapore</w:t>
       </w:r>
-      <w:proofErr w:type="spellEnd"/>
     </w:p>
     <w:p>
       <w:pPr>
@@ -5340,27 +5140,15 @@
           <w:szCs w:val="28"/>
         </w:rPr>
       </w:pPr>
-      <w:proofErr w:type="spellStart"/>
-      <w:r>
-        <w:rPr>
-          <w:rFonts w:ascii="Times New Roman" w:hAnsi="Times New Roman" w:cs="Times New Roman"/>
-          <w:b/>
-          <w:bCs/>
-          <w:sz w:val="28"/>
-          <w:szCs w:val="28"/>
-        </w:rPr>
-        <w:t>Hagit</w:t>
-      </w:r>
-      <w:proofErr w:type="spellEnd"/>
-      <w:r>
-        <w:rPr>
-          <w:rFonts w:ascii="Times New Roman" w:hAnsi="Times New Roman" w:cs="Times New Roman"/>
-          <w:b/>
-          <w:bCs/>
-          <w:sz w:val="28"/>
-          <w:szCs w:val="28"/>
-        </w:rPr>
-        <w:t xml:space="preserve"> Levy-Shalev</w:t>
+      <w:r>
+        <w:rPr>
+          <w:rFonts w:ascii="Times New Roman" w:hAnsi="Times New Roman" w:cs="Times New Roman"/>
+          <w:b/>
+          <w:bCs/>
+          <w:sz w:val="28"/>
+          <w:szCs w:val="28"/>
+        </w:rPr>
+        <w:t>Hagit Levy-Shalev</w:t>
       </w:r>
     </w:p>
     <w:p>
@@ -5390,47 +5178,38 @@
         <w:spacing w:after="0" w:line="240" w:lineRule="auto"/>
         <w:rPr>
           <w:rFonts w:ascii="Times New Roman" w:hAnsi="Times New Roman" w:cs="Times New Roman"/>
-          <w:b/>
-          <w:bCs/>
-          <w:sz w:val="28"/>
-          <w:szCs w:val="28"/>
-        </w:rPr>
-      </w:pPr>
-    </w:p>
-    <w:p>
-      <w:pPr>
-        <w:spacing w:after="0" w:line="240" w:lineRule="auto"/>
-        <w:rPr>
-          <w:rFonts w:ascii="Times New Roman" w:hAnsi="Times New Roman" w:cs="Times New Roman"/>
-          <w:b/>
-          <w:bCs/>
-          <w:sz w:val="28"/>
-          <w:szCs w:val="28"/>
-        </w:rPr>
-      </w:pPr>
-      <w:r>
-        <w:rPr>
-          <w:rFonts w:ascii="Times New Roman" w:hAnsi="Times New Roman" w:cs="Times New Roman"/>
-          <w:b/>
-          <w:bCs/>
-          <w:sz w:val="28"/>
-          <w:szCs w:val="28"/>
-        </w:rPr>
-        <w:t>Yen Tong</w:t>
-      </w:r>
-    </w:p>
-    <w:p>
-      <w:pPr>
-        <w:spacing w:after="0" w:line="240" w:lineRule="auto"/>
-        <w:rPr>
-          <w:rFonts w:ascii="Times New Roman" w:hAnsi="Times New Roman" w:cs="Times New Roman"/>
           <w:i/>
           <w:iCs/>
           <w:sz w:val="28"/>
           <w:szCs w:val="28"/>
         </w:rPr>
       </w:pPr>
-      <w:r>
+    </w:p>
+    <w:p>
+      <w:pPr>
+        <w:spacing w:after="0" w:line="240" w:lineRule="auto"/>
+        <w:rPr>
+          <w:rFonts w:ascii="Times New Roman" w:hAnsi="Times New Roman" w:cs="Times New Roman"/>
+          <w:b/>
+          <w:bCs/>
+          <w:sz w:val="28"/>
+          <w:szCs w:val="28"/>
+        </w:rPr>
+      </w:pPr>
+      <w:r>
+        <w:rPr>
+          <w:rFonts w:ascii="Times New Roman" w:hAnsi="Times New Roman" w:cs="Times New Roman"/>
+          <w:b/>
+          <w:bCs/>
+          <w:sz w:val="28"/>
+          <w:szCs w:val="28"/>
+        </w:rPr>
+        <w:t>Lorraine Lee</w:t>
+      </w:r>
+    </w:p>
+    <w:p>
+      <w:pPr>
+        <w:spacing w:after="0" w:line="240" w:lineRule="auto"/>
         <w:rPr>
           <w:rFonts w:ascii="Times New Roman" w:hAnsi="Times New Roman" w:cs="Times New Roman"/>
           <w:i/>
@@ -5438,46 +5217,8 @@
           <w:sz w:val="28"/>
           <w:szCs w:val="28"/>
         </w:rPr>
-        <w:t>Nanyang Technological University</w:t>
-      </w:r>
-    </w:p>
-    <w:p>
-      <w:pPr>
-        <w:spacing w:after="0" w:line="240" w:lineRule="auto"/>
-        <w:rPr>
-          <w:rFonts w:ascii="Times New Roman" w:hAnsi="Times New Roman" w:cs="Times New Roman"/>
-          <w:b/>
-          <w:bCs/>
-          <w:sz w:val="28"/>
-          <w:szCs w:val="28"/>
-        </w:rPr>
-      </w:pPr>
-    </w:p>
-    <w:p>
-      <w:pPr>
-        <w:spacing w:after="0" w:line="240" w:lineRule="auto"/>
-        <w:rPr>
-          <w:rFonts w:ascii="Times New Roman" w:hAnsi="Times New Roman" w:cs="Times New Roman"/>
-          <w:b/>
-          <w:bCs/>
-          <w:sz w:val="28"/>
-          <w:szCs w:val="28"/>
-        </w:rPr>
-      </w:pPr>
-      <w:r>
-        <w:rPr>
-          <w:rFonts w:ascii="Times New Roman" w:hAnsi="Times New Roman" w:cs="Times New Roman"/>
-          <w:b/>
-          <w:bCs/>
-          <w:sz w:val="28"/>
-          <w:szCs w:val="28"/>
-        </w:rPr>
-        <w:t>Hun-Tong Tan</w:t>
-      </w:r>
-    </w:p>
-    <w:p>
-      <w:pPr>
-        <w:spacing w:after="0" w:line="240" w:lineRule="auto"/>
+      </w:pPr>
+      <w:r>
         <w:rPr>
           <w:rFonts w:ascii="Times New Roman" w:hAnsi="Times New Roman" w:cs="Times New Roman"/>
           <w:i/>
@@ -5485,8 +5226,12 @@
           <w:sz w:val="28"/>
           <w:szCs w:val="28"/>
         </w:rPr>
-      </w:pPr>
-      <w:r>
+        <w:t>UNC Wilmington</w:t>
+      </w:r>
+    </w:p>
+    <w:p>
+      <w:pPr>
+        <w:spacing w:after="0" w:line="240" w:lineRule="auto"/>
         <w:rPr>
           <w:rFonts w:ascii="Times New Roman" w:hAnsi="Times New Roman" w:cs="Times New Roman"/>
           <w:i/>
@@ -5494,18 +5239,105 @@
           <w:sz w:val="28"/>
           <w:szCs w:val="28"/>
         </w:rPr>
+      </w:pPr>
+    </w:p>
+    <w:p>
+      <w:pPr>
+        <w:spacing w:after="0" w:line="240" w:lineRule="auto"/>
+        <w:rPr>
+          <w:rFonts w:ascii="Times New Roman" w:hAnsi="Times New Roman" w:cs="Times New Roman"/>
+          <w:b/>
+          <w:bCs/>
+          <w:sz w:val="28"/>
+          <w:szCs w:val="28"/>
+        </w:rPr>
+      </w:pPr>
+      <w:r>
+        <w:rPr>
+          <w:rFonts w:ascii="Times New Roman" w:hAnsi="Times New Roman" w:cs="Times New Roman"/>
+          <w:b/>
+          <w:bCs/>
+          <w:sz w:val="28"/>
+          <w:szCs w:val="28"/>
+        </w:rPr>
+        <w:t>Diana Weng</w:t>
+      </w:r>
+    </w:p>
+    <w:p>
+      <w:pPr>
+        <w:spacing w:after="0" w:line="240" w:lineRule="auto"/>
+        <w:rPr>
+          <w:rFonts w:ascii="Times New Roman" w:hAnsi="Times New Roman" w:cs="Times New Roman"/>
+          <w:sz w:val="28"/>
+          <w:szCs w:val="28"/>
+        </w:rPr>
+      </w:pPr>
+      <w:r>
+        <w:rPr>
+          <w:rFonts w:ascii="Times New Roman" w:hAnsi="Times New Roman" w:cs="Times New Roman"/>
+          <w:i/>
+          <w:iCs/>
+          <w:sz w:val="28"/>
+          <w:szCs w:val="28"/>
+        </w:rPr>
+        <w:t>University of South Florida</w:t>
+      </w:r>
+    </w:p>
+    <w:p>
+      <w:pPr>
+        <w:spacing w:after="0" w:line="240" w:lineRule="auto"/>
+        <w:rPr>
+          <w:rFonts w:ascii="Times New Roman" w:hAnsi="Times New Roman" w:cs="Times New Roman"/>
+          <w:b/>
+          <w:bCs/>
+          <w:sz w:val="28"/>
+          <w:szCs w:val="28"/>
+        </w:rPr>
+      </w:pPr>
+    </w:p>
+    <w:p>
+      <w:pPr>
+        <w:spacing w:after="0" w:line="240" w:lineRule="auto"/>
+        <w:rPr>
+          <w:rFonts w:ascii="Times New Roman" w:hAnsi="Times New Roman" w:cs="Times New Roman"/>
+          <w:b/>
+          <w:bCs/>
+          <w:sz w:val="28"/>
+          <w:szCs w:val="28"/>
+        </w:rPr>
+      </w:pPr>
+      <w:r>
+        <w:rPr>
+          <w:rFonts w:ascii="Times New Roman" w:hAnsi="Times New Roman" w:cs="Times New Roman"/>
+          <w:b/>
+          <w:bCs/>
+          <w:sz w:val="28"/>
+          <w:szCs w:val="28"/>
+        </w:rPr>
+        <w:t>Yen Tong</w:t>
+      </w:r>
+    </w:p>
+    <w:p>
+      <w:pPr>
+        <w:spacing w:after="0" w:line="240" w:lineRule="auto"/>
+        <w:rPr>
+          <w:rFonts w:ascii="Times New Roman" w:hAnsi="Times New Roman" w:cs="Times New Roman"/>
+          <w:i/>
+          <w:iCs/>
+          <w:sz w:val="28"/>
+          <w:szCs w:val="28"/>
+        </w:rPr>
+      </w:pPr>
+      <w:r>
+        <w:rPr>
+          <w:rFonts w:ascii="Times New Roman" w:hAnsi="Times New Roman" w:cs="Times New Roman"/>
+          <w:i/>
+          <w:iCs/>
+          <w:sz w:val="28"/>
+          <w:szCs w:val="28"/>
+        </w:rPr>
         <w:t>Nanyang Technological University</w:t>
       </w:r>
-    </w:p>
-    <w:p>
-      <w:pPr>
-        <w:spacing w:after="0" w:line="240" w:lineRule="auto"/>
-        <w:rPr>
-          <w:rFonts w:ascii="Times New Roman" w:hAnsi="Times New Roman" w:cs="Times New Roman"/>
-          <w:sz w:val="28"/>
-          <w:szCs w:val="28"/>
-        </w:rPr>
-      </w:pPr>
     </w:p>
     <w:sectPr>
       <w:headerReference w:type="even" r:id="rId8"/>

</xml_diff>